<commit_message>
All backend modelu test complete
</commit_message>
<xml_diff>
--- a/NexusFlow_Synopsis_Harsh.docx
+++ b/NexusFlow_Synopsis_Harsh.docx
@@ -133,62 +133,20 @@
         <w:rPr>
           <w:rFonts w:ascii="Times New Roman" w:hAnsi="Times New Roman" w:cs="Times New Roman"/>
         </w:rPr>
-        <w:t xml:space="preserve">[Your Guide </w:t>
-      </w:r>
-      <w:proofErr w:type="gramStart"/>
-      <w:r>
-        <w:rPr>
-          <w:rFonts w:ascii="Times New Roman" w:hAnsi="Times New Roman" w:cs="Times New Roman"/>
-        </w:rPr>
-        <w:t xml:space="preserve">Name]   </w:t>
-      </w:r>
-      <w:proofErr w:type="gramEnd"/>
-      <w:r>
-        <w:rPr>
-          <w:rFonts w:ascii="Times New Roman" w:hAnsi="Times New Roman" w:cs="Times New Roman"/>
-        </w:rPr>
-        <w:t xml:space="preserve">                   Harsh</w:t>
-      </w:r>
-    </w:p>
-    <w:p>
-      <w:pPr>
-        <w:rPr>
-          <w:rFonts w:ascii="Times New Roman" w:hAnsi="Times New Roman" w:cs="Times New Roman"/>
-        </w:rPr>
-      </w:pPr>
-      <w:r>
-        <w:rPr>
-          <w:rFonts w:ascii="Times New Roman" w:hAnsi="Times New Roman" w:cs="Times New Roman"/>
-        </w:rPr>
-        <w:t>[</w:t>
-      </w:r>
-      <w:proofErr w:type="gramStart"/>
-      <w:r>
-        <w:rPr>
-          <w:rFonts w:ascii="Times New Roman" w:hAnsi="Times New Roman" w:cs="Times New Roman"/>
-        </w:rPr>
-        <w:t xml:space="preserve">Designation]   </w:t>
-      </w:r>
-      <w:proofErr w:type="gramEnd"/>
-      <w:r>
-        <w:rPr>
-          <w:rFonts w:ascii="Times New Roman" w:hAnsi="Times New Roman" w:cs="Times New Roman"/>
-        </w:rPr>
-        <w:t xml:space="preserve">                    </w:t>
-      </w:r>
-      <w:proofErr w:type="gramStart"/>
-      <w:r>
-        <w:rPr>
-          <w:rFonts w:ascii="Times New Roman" w:hAnsi="Times New Roman" w:cs="Times New Roman"/>
-        </w:rPr>
-        <w:t xml:space="preserve">   [</w:t>
-      </w:r>
-      <w:proofErr w:type="gramEnd"/>
-      <w:r>
-        <w:rPr>
-          <w:rFonts w:ascii="Times New Roman" w:hAnsi="Times New Roman" w:cs="Times New Roman"/>
-        </w:rPr>
-        <w:t xml:space="preserve">Your </w:t>
+        <w:t>[Your Guide Name]                      Harsh</w:t>
+      </w:r>
+    </w:p>
+    <w:p>
+      <w:pPr>
+        <w:rPr>
+          <w:rFonts w:ascii="Times New Roman" w:hAnsi="Times New Roman" w:cs="Times New Roman"/>
+        </w:rPr>
+      </w:pPr>
+      <w:r>
+        <w:rPr>
+          <w:rFonts w:ascii="Times New Roman" w:hAnsi="Times New Roman" w:cs="Times New Roman"/>
+        </w:rPr>
+        <w:t xml:space="preserve">[Designation]                          [Your </w:t>
       </w:r>
       <w:proofErr w:type="spellStart"/>
       <w:r>
@@ -410,6 +368,33 @@
         </w:rPr>
         <w:t>1. Title of the Project</w:t>
       </w:r>
+      <w:r>
+        <w:rPr>
+          <w:rFonts w:ascii="Times New Roman" w:hAnsi="Times New Roman" w:cs="Times New Roman"/>
+        </w:rPr>
+        <w:t xml:space="preserve">: </w:t>
+      </w:r>
+    </w:p>
+    <w:p>
+      <w:pPr>
+        <w:rPr>
+          <w:rFonts w:ascii="Times New Roman" w:hAnsi="Times New Roman" w:cs="Times New Roman"/>
+        </w:rPr>
+      </w:pPr>
+      <w:proofErr w:type="spellStart"/>
+      <w:r>
+        <w:rPr>
+          <w:rFonts w:ascii="Times New Roman" w:hAnsi="Times New Roman" w:cs="Times New Roman"/>
+        </w:rPr>
+        <w:t>NexusFlow</w:t>
+      </w:r>
+      <w:proofErr w:type="spellEnd"/>
+      <w:r>
+        <w:rPr>
+          <w:rFonts w:ascii="Times New Roman" w:hAnsi="Times New Roman" w:cs="Times New Roman"/>
+        </w:rPr>
+        <w:t xml:space="preserve"> – Enterprise Project &amp; Team Collaboration Management System</w:t>
+      </w:r>
     </w:p>
     <w:p>
       <w:pPr>
@@ -437,6 +422,401 @@
           <w:rFonts w:ascii="Times New Roman" w:hAnsi="Times New Roman" w:cs="Times New Roman"/>
         </w:rPr>
       </w:pPr>
+      <w:r>
+        <w:rPr>
+          <w:rFonts w:ascii="Times New Roman" w:hAnsi="Times New Roman" w:cs="Times New Roman"/>
+        </w:rPr>
+        <w:t xml:space="preserve">In most small organizations, startups, and student project teams, project </w:t>
+      </w:r>
+    </w:p>
+    <w:p>
+      <w:pPr>
+        <w:rPr>
+          <w:rFonts w:ascii="Times New Roman" w:hAnsi="Times New Roman" w:cs="Times New Roman"/>
+        </w:rPr>
+      </w:pPr>
+      <w:r>
+        <w:rPr>
+          <w:rFonts w:ascii="Times New Roman" w:hAnsi="Times New Roman" w:cs="Times New Roman"/>
+        </w:rPr>
+        <w:t xml:space="preserve">management and team collaboration are handled manually or through a </w:t>
+      </w:r>
+    </w:p>
+    <w:p>
+      <w:pPr>
+        <w:rPr>
+          <w:rFonts w:ascii="Times New Roman" w:hAnsi="Times New Roman" w:cs="Times New Roman"/>
+        </w:rPr>
+      </w:pPr>
+      <w:r>
+        <w:rPr>
+          <w:rFonts w:ascii="Times New Roman" w:hAnsi="Times New Roman" w:cs="Times New Roman"/>
+        </w:rPr>
+        <w:t xml:space="preserve">combination of disconnected tools. Typically, teams rely on spreadsheets </w:t>
+      </w:r>
+    </w:p>
+    <w:p>
+      <w:pPr>
+        <w:rPr>
+          <w:rFonts w:ascii="Times New Roman" w:hAnsi="Times New Roman" w:cs="Times New Roman"/>
+        </w:rPr>
+      </w:pPr>
+      <w:r>
+        <w:rPr>
+          <w:rFonts w:ascii="Times New Roman" w:hAnsi="Times New Roman" w:cs="Times New Roman"/>
+        </w:rPr>
+        <w:t xml:space="preserve">for task tracking, instant messaging applications such as WhatsApp for </w:t>
+      </w:r>
+    </w:p>
+    <w:p>
+      <w:pPr>
+        <w:rPr>
+          <w:rFonts w:ascii="Times New Roman" w:hAnsi="Times New Roman" w:cs="Times New Roman"/>
+        </w:rPr>
+      </w:pPr>
+      <w:r>
+        <w:rPr>
+          <w:rFonts w:ascii="Times New Roman" w:hAnsi="Times New Roman" w:cs="Times New Roman"/>
+        </w:rPr>
+        <w:t xml:space="preserve">communication, separate cloud storage tools for file sharing, and email </w:t>
+      </w:r>
+    </w:p>
+    <w:p>
+      <w:pPr>
+        <w:rPr>
+          <w:rFonts w:ascii="Times New Roman" w:hAnsi="Times New Roman" w:cs="Times New Roman"/>
+        </w:rPr>
+      </w:pPr>
+      <w:r>
+        <w:rPr>
+          <w:rFonts w:ascii="Times New Roman" w:hAnsi="Times New Roman" w:cs="Times New Roman"/>
+        </w:rPr>
+        <w:t>for status reporting.</w:t>
+      </w:r>
+    </w:p>
+    <w:p>
+      <w:pPr>
+        <w:rPr>
+          <w:rFonts w:ascii="Times New Roman" w:hAnsi="Times New Roman" w:cs="Times New Roman"/>
+        </w:rPr>
+      </w:pPr>
+    </w:p>
+    <w:p>
+      <w:pPr>
+        <w:rPr>
+          <w:rFonts w:ascii="Times New Roman" w:hAnsi="Times New Roman" w:cs="Times New Roman"/>
+        </w:rPr>
+      </w:pPr>
+      <w:r>
+        <w:rPr>
+          <w:rFonts w:ascii="Times New Roman" w:hAnsi="Times New Roman" w:cs="Times New Roman"/>
+        </w:rPr>
+        <w:t>This fragmented approach leads to several practical problems:</w:t>
+      </w:r>
+    </w:p>
+    <w:p>
+      <w:pPr>
+        <w:rPr>
+          <w:rFonts w:ascii="Times New Roman" w:hAnsi="Times New Roman" w:cs="Times New Roman"/>
+        </w:rPr>
+      </w:pPr>
+    </w:p>
+    <w:p>
+      <w:pPr>
+        <w:rPr>
+          <w:rFonts w:ascii="Times New Roman" w:hAnsi="Times New Roman" w:cs="Times New Roman"/>
+        </w:rPr>
+      </w:pPr>
+      <w:r>
+        <w:rPr>
+          <w:rFonts w:ascii="Times New Roman" w:hAnsi="Times New Roman" w:cs="Times New Roman"/>
+        </w:rPr>
+        <w:t xml:space="preserve">1. Data Inconsistency: Project information is scattered across multiple </w:t>
+      </w:r>
+    </w:p>
+    <w:p>
+      <w:pPr>
+        <w:rPr>
+          <w:rFonts w:ascii="Times New Roman" w:hAnsi="Times New Roman" w:cs="Times New Roman"/>
+        </w:rPr>
+      </w:pPr>
+      <w:r>
+        <w:rPr>
+          <w:rFonts w:ascii="Times New Roman" w:hAnsi="Times New Roman" w:cs="Times New Roman"/>
+        </w:rPr>
+        <w:t xml:space="preserve">   platforms, making it difficult to maintain a single source of truth.</w:t>
+      </w:r>
+    </w:p>
+    <w:p>
+      <w:pPr>
+        <w:rPr>
+          <w:rFonts w:ascii="Times New Roman" w:hAnsi="Times New Roman" w:cs="Times New Roman"/>
+        </w:rPr>
+      </w:pPr>
+    </w:p>
+    <w:p>
+      <w:pPr>
+        <w:rPr>
+          <w:rFonts w:ascii="Times New Roman" w:hAnsi="Times New Roman" w:cs="Times New Roman"/>
+        </w:rPr>
+      </w:pPr>
+      <w:r>
+        <w:rPr>
+          <w:rFonts w:ascii="Times New Roman" w:hAnsi="Times New Roman" w:cs="Times New Roman"/>
+        </w:rPr>
+        <w:t xml:space="preserve">2. Lack of Accountability: Without a centralized task assignment system, </w:t>
+      </w:r>
+    </w:p>
+    <w:p>
+      <w:pPr>
+        <w:rPr>
+          <w:rFonts w:ascii="Times New Roman" w:hAnsi="Times New Roman" w:cs="Times New Roman"/>
+        </w:rPr>
+      </w:pPr>
+      <w:r>
+        <w:rPr>
+          <w:rFonts w:ascii="Times New Roman" w:hAnsi="Times New Roman" w:cs="Times New Roman"/>
+        </w:rPr>
+        <w:t xml:space="preserve">   it becomes difficult to track who is responsible for which task and </w:t>
+      </w:r>
+    </w:p>
+    <w:p>
+      <w:pPr>
+        <w:rPr>
+          <w:rFonts w:ascii="Times New Roman" w:hAnsi="Times New Roman" w:cs="Times New Roman"/>
+        </w:rPr>
+      </w:pPr>
+      <w:r>
+        <w:rPr>
+          <w:rFonts w:ascii="Times New Roman" w:hAnsi="Times New Roman" w:cs="Times New Roman"/>
+        </w:rPr>
+        <w:t xml:space="preserve">   by when it should be completed.</w:t>
+      </w:r>
+    </w:p>
+    <w:p>
+      <w:pPr>
+        <w:rPr>
+          <w:rFonts w:ascii="Times New Roman" w:hAnsi="Times New Roman" w:cs="Times New Roman"/>
+        </w:rPr>
+      </w:pPr>
+    </w:p>
+    <w:p>
+      <w:pPr>
+        <w:rPr>
+          <w:rFonts w:ascii="Times New Roman" w:hAnsi="Times New Roman" w:cs="Times New Roman"/>
+        </w:rPr>
+      </w:pPr>
+      <w:r>
+        <w:rPr>
+          <w:rFonts w:ascii="Times New Roman" w:hAnsi="Times New Roman" w:cs="Times New Roman"/>
+        </w:rPr>
+        <w:t xml:space="preserve">3. Poor Visibility: Project managers and stakeholders lack a real-time, </w:t>
+      </w:r>
+    </w:p>
+    <w:p>
+      <w:pPr>
+        <w:rPr>
+          <w:rFonts w:ascii="Times New Roman" w:hAnsi="Times New Roman" w:cs="Times New Roman"/>
+        </w:rPr>
+      </w:pPr>
+      <w:r>
+        <w:rPr>
+          <w:rFonts w:ascii="Times New Roman" w:hAnsi="Times New Roman" w:cs="Times New Roman"/>
+        </w:rPr>
+        <w:t xml:space="preserve">   unified view of project progress, task status, and team workload.</w:t>
+      </w:r>
+    </w:p>
+    <w:p>
+      <w:pPr>
+        <w:rPr>
+          <w:rFonts w:ascii="Times New Roman" w:hAnsi="Times New Roman" w:cs="Times New Roman"/>
+        </w:rPr>
+      </w:pPr>
+    </w:p>
+    <w:p>
+      <w:pPr>
+        <w:rPr>
+          <w:rFonts w:ascii="Times New Roman" w:hAnsi="Times New Roman" w:cs="Times New Roman"/>
+        </w:rPr>
+      </w:pPr>
+      <w:r>
+        <w:rPr>
+          <w:rFonts w:ascii="Times New Roman" w:hAnsi="Times New Roman" w:cs="Times New Roman"/>
+        </w:rPr>
+        <w:t xml:space="preserve">4. Communication Gaps: Important discussions related to specific tasks </w:t>
+      </w:r>
+    </w:p>
+    <w:p>
+      <w:pPr>
+        <w:rPr>
+          <w:rFonts w:ascii="Times New Roman" w:hAnsi="Times New Roman" w:cs="Times New Roman"/>
+        </w:rPr>
+      </w:pPr>
+      <w:r>
+        <w:rPr>
+          <w:rFonts w:ascii="Times New Roman" w:hAnsi="Times New Roman" w:cs="Times New Roman"/>
+        </w:rPr>
+        <w:t xml:space="preserve">   get lost in general chat applications, disconnected from the actual </w:t>
+      </w:r>
+    </w:p>
+    <w:p>
+      <w:pPr>
+        <w:rPr>
+          <w:rFonts w:ascii="Times New Roman" w:hAnsi="Times New Roman" w:cs="Times New Roman"/>
+        </w:rPr>
+      </w:pPr>
+      <w:r>
+        <w:rPr>
+          <w:rFonts w:ascii="Times New Roman" w:hAnsi="Times New Roman" w:cs="Times New Roman"/>
+        </w:rPr>
+        <w:t xml:space="preserve">   work item they relate to.</w:t>
+      </w:r>
+    </w:p>
+    <w:p>
+      <w:pPr>
+        <w:rPr>
+          <w:rFonts w:ascii="Times New Roman" w:hAnsi="Times New Roman" w:cs="Times New Roman"/>
+        </w:rPr>
+      </w:pPr>
+    </w:p>
+    <w:p>
+      <w:pPr>
+        <w:rPr>
+          <w:rFonts w:ascii="Times New Roman" w:hAnsi="Times New Roman" w:cs="Times New Roman"/>
+        </w:rPr>
+      </w:pPr>
+      <w:r>
+        <w:rPr>
+          <w:rFonts w:ascii="Times New Roman" w:hAnsi="Times New Roman" w:cs="Times New Roman"/>
+        </w:rPr>
+        <w:t xml:space="preserve">5. Manual Reporting: Generating progress reports requires manually </w:t>
+      </w:r>
+    </w:p>
+    <w:p>
+      <w:pPr>
+        <w:rPr>
+          <w:rFonts w:ascii="Times New Roman" w:hAnsi="Times New Roman" w:cs="Times New Roman"/>
+        </w:rPr>
+      </w:pPr>
+      <w:r>
+        <w:rPr>
+          <w:rFonts w:ascii="Times New Roman" w:hAnsi="Times New Roman" w:cs="Times New Roman"/>
+        </w:rPr>
+        <w:t xml:space="preserve">   compiling data from multiple sources, which is time-consuming and </w:t>
+      </w:r>
+    </w:p>
+    <w:p>
+      <w:pPr>
+        <w:rPr>
+          <w:rFonts w:ascii="Times New Roman" w:hAnsi="Times New Roman" w:cs="Times New Roman"/>
+        </w:rPr>
+      </w:pPr>
+      <w:r>
+        <w:rPr>
+          <w:rFonts w:ascii="Times New Roman" w:hAnsi="Times New Roman" w:cs="Times New Roman"/>
+        </w:rPr>
+        <w:t xml:space="preserve">   error-prone.</w:t>
+      </w:r>
+    </w:p>
+    <w:p>
+      <w:pPr>
+        <w:rPr>
+          <w:rFonts w:ascii="Times New Roman" w:hAnsi="Times New Roman" w:cs="Times New Roman"/>
+        </w:rPr>
+      </w:pPr>
+    </w:p>
+    <w:p>
+      <w:pPr>
+        <w:rPr>
+          <w:rFonts w:ascii="Times New Roman" w:hAnsi="Times New Roman" w:cs="Times New Roman"/>
+        </w:rPr>
+      </w:pPr>
+      <w:r>
+        <w:rPr>
+          <w:rFonts w:ascii="Times New Roman" w:hAnsi="Times New Roman" w:cs="Times New Roman"/>
+        </w:rPr>
+        <w:lastRenderedPageBreak/>
+        <w:t xml:space="preserve">6. No Role-Based Access: Existing manual systems do not enforce </w:t>
+      </w:r>
+    </w:p>
+    <w:p>
+      <w:pPr>
+        <w:rPr>
+          <w:rFonts w:ascii="Times New Roman" w:hAnsi="Times New Roman" w:cs="Times New Roman"/>
+        </w:rPr>
+      </w:pPr>
+      <w:r>
+        <w:rPr>
+          <w:rFonts w:ascii="Times New Roman" w:hAnsi="Times New Roman" w:cs="Times New Roman"/>
+        </w:rPr>
+        <w:t xml:space="preserve">   role-based permissions, making it difficult to control who can view, </w:t>
+      </w:r>
+    </w:p>
+    <w:p>
+      <w:pPr>
+        <w:rPr>
+          <w:rFonts w:ascii="Times New Roman" w:hAnsi="Times New Roman" w:cs="Times New Roman"/>
+        </w:rPr>
+      </w:pPr>
+      <w:r>
+        <w:rPr>
+          <w:rFonts w:ascii="Times New Roman" w:hAnsi="Times New Roman" w:cs="Times New Roman"/>
+        </w:rPr>
+        <w:t xml:space="preserve">   edit, or approve specific project information.</w:t>
+      </w:r>
+    </w:p>
+    <w:p>
+      <w:pPr>
+        <w:rPr>
+          <w:rFonts w:ascii="Times New Roman" w:hAnsi="Times New Roman" w:cs="Times New Roman"/>
+        </w:rPr>
+      </w:pPr>
+    </w:p>
+    <w:p>
+      <w:pPr>
+        <w:rPr>
+          <w:rFonts w:ascii="Times New Roman" w:hAnsi="Times New Roman" w:cs="Times New Roman"/>
+        </w:rPr>
+      </w:pPr>
+      <w:r>
+        <w:rPr>
+          <w:rFonts w:ascii="Times New Roman" w:hAnsi="Times New Roman" w:cs="Times New Roman"/>
+        </w:rPr>
+        <w:t xml:space="preserve">These limitations reduce productivity, increase the chances of missed </w:t>
+      </w:r>
+    </w:p>
+    <w:p>
+      <w:pPr>
+        <w:rPr>
+          <w:rFonts w:ascii="Times New Roman" w:hAnsi="Times New Roman" w:cs="Times New Roman"/>
+        </w:rPr>
+      </w:pPr>
+      <w:r>
+        <w:rPr>
+          <w:rFonts w:ascii="Times New Roman" w:hAnsi="Times New Roman" w:cs="Times New Roman"/>
+        </w:rPr>
+        <w:t xml:space="preserve">deadlines, and make it difficult to scale project management practices </w:t>
+      </w:r>
+    </w:p>
+    <w:p>
+      <w:pPr>
+        <w:rPr>
+          <w:rFonts w:ascii="Times New Roman" w:hAnsi="Times New Roman" w:cs="Times New Roman"/>
+        </w:rPr>
+      </w:pPr>
+      <w:r>
+        <w:rPr>
+          <w:rFonts w:ascii="Times New Roman" w:hAnsi="Times New Roman" w:cs="Times New Roman"/>
+        </w:rPr>
+        <w:t>as a team grows.</w:t>
+      </w:r>
+    </w:p>
+    <w:p>
+      <w:pPr>
+        <w:rPr>
+          <w:rFonts w:ascii="Times New Roman" w:hAnsi="Times New Roman" w:cs="Times New Roman"/>
+        </w:rPr>
+      </w:pPr>
     </w:p>
     <w:p>
       <w:pPr>
@@ -457,6 +837,298 @@
           <w:rFonts w:ascii="Times New Roman" w:hAnsi="Times New Roman" w:cs="Times New Roman"/>
         </w:rPr>
       </w:pPr>
+      <w:proofErr w:type="spellStart"/>
+      <w:r>
+        <w:rPr>
+          <w:rFonts w:ascii="Times New Roman" w:hAnsi="Times New Roman" w:cs="Times New Roman"/>
+        </w:rPr>
+        <w:t>NexusFlow</w:t>
+      </w:r>
+      <w:proofErr w:type="spellEnd"/>
+      <w:r>
+        <w:rPr>
+          <w:rFonts w:ascii="Times New Roman" w:hAnsi="Times New Roman" w:cs="Times New Roman"/>
+        </w:rPr>
+        <w:t xml:space="preserve"> is a web-based, role-driven Enterprise Project and Team </w:t>
+      </w:r>
+    </w:p>
+    <w:p>
+      <w:pPr>
+        <w:rPr>
+          <w:rFonts w:ascii="Times New Roman" w:hAnsi="Times New Roman" w:cs="Times New Roman"/>
+        </w:rPr>
+      </w:pPr>
+      <w:r>
+        <w:rPr>
+          <w:rFonts w:ascii="Times New Roman" w:hAnsi="Times New Roman" w:cs="Times New Roman"/>
+        </w:rPr>
+        <w:t xml:space="preserve">Collaboration Management System designed to unify project management, </w:t>
+      </w:r>
+    </w:p>
+    <w:p>
+      <w:pPr>
+        <w:rPr>
+          <w:rFonts w:ascii="Times New Roman" w:hAnsi="Times New Roman" w:cs="Times New Roman"/>
+        </w:rPr>
+      </w:pPr>
+      <w:r>
+        <w:rPr>
+          <w:rFonts w:ascii="Times New Roman" w:hAnsi="Times New Roman" w:cs="Times New Roman"/>
+        </w:rPr>
+        <w:t xml:space="preserve">task tracking, team collaboration, and reporting into a single </w:t>
+      </w:r>
+    </w:p>
+    <w:p>
+      <w:pPr>
+        <w:rPr>
+          <w:rFonts w:ascii="Times New Roman" w:hAnsi="Times New Roman" w:cs="Times New Roman"/>
+        </w:rPr>
+      </w:pPr>
+      <w:r>
+        <w:rPr>
+          <w:rFonts w:ascii="Times New Roman" w:hAnsi="Times New Roman" w:cs="Times New Roman"/>
+        </w:rPr>
+        <w:t>integrated platform.</w:t>
+      </w:r>
+    </w:p>
+    <w:p>
+      <w:pPr>
+        <w:rPr>
+          <w:rFonts w:ascii="Times New Roman" w:hAnsi="Times New Roman" w:cs="Times New Roman"/>
+        </w:rPr>
+      </w:pPr>
+    </w:p>
+    <w:p>
+      <w:pPr>
+        <w:rPr>
+          <w:rFonts w:ascii="Times New Roman" w:hAnsi="Times New Roman" w:cs="Times New Roman"/>
+        </w:rPr>
+      </w:pPr>
+      <w:r>
+        <w:rPr>
+          <w:rFonts w:ascii="Times New Roman" w:hAnsi="Times New Roman" w:cs="Times New Roman"/>
+        </w:rPr>
+        <w:t xml:space="preserve">The system allows organizations to create projects, assign tasks to </w:t>
+      </w:r>
+    </w:p>
+    <w:p>
+      <w:pPr>
+        <w:rPr>
+          <w:rFonts w:ascii="Times New Roman" w:hAnsi="Times New Roman" w:cs="Times New Roman"/>
+        </w:rPr>
+      </w:pPr>
+      <w:r>
+        <w:rPr>
+          <w:rFonts w:ascii="Times New Roman" w:hAnsi="Times New Roman" w:cs="Times New Roman"/>
+        </w:rPr>
+        <w:t xml:space="preserve">team members, track task progress through defined statuses, collaborate </w:t>
+      </w:r>
+    </w:p>
+    <w:p>
+      <w:pPr>
+        <w:rPr>
+          <w:rFonts w:ascii="Times New Roman" w:hAnsi="Times New Roman" w:cs="Times New Roman"/>
+        </w:rPr>
+      </w:pPr>
+      <w:r>
+        <w:rPr>
+          <w:rFonts w:ascii="Times New Roman" w:hAnsi="Times New Roman" w:cs="Times New Roman"/>
+        </w:rPr>
+        <w:t xml:space="preserve">through task-specific comments, and receive real-time notifications for </w:t>
+      </w:r>
+    </w:p>
+    <w:p>
+      <w:pPr>
+        <w:rPr>
+          <w:rFonts w:ascii="Times New Roman" w:hAnsi="Times New Roman" w:cs="Times New Roman"/>
+        </w:rPr>
+      </w:pPr>
+      <w:r>
+        <w:rPr>
+          <w:rFonts w:ascii="Times New Roman" w:hAnsi="Times New Roman" w:cs="Times New Roman"/>
+        </w:rPr>
+        <w:t>important updates such as task assignments.</w:t>
+      </w:r>
+    </w:p>
+    <w:p>
+      <w:pPr>
+        <w:rPr>
+          <w:rFonts w:ascii="Times New Roman" w:hAnsi="Times New Roman" w:cs="Times New Roman"/>
+        </w:rPr>
+      </w:pPr>
+    </w:p>
+    <w:p>
+      <w:pPr>
+        <w:rPr>
+          <w:rFonts w:ascii="Times New Roman" w:hAnsi="Times New Roman" w:cs="Times New Roman"/>
+        </w:rPr>
+      </w:pPr>
+      <w:proofErr w:type="spellStart"/>
+      <w:r>
+        <w:rPr>
+          <w:rFonts w:ascii="Times New Roman" w:hAnsi="Times New Roman" w:cs="Times New Roman"/>
+        </w:rPr>
+        <w:t>NexusFlow</w:t>
+      </w:r>
+      <w:proofErr w:type="spellEnd"/>
+      <w:r>
+        <w:rPr>
+          <w:rFonts w:ascii="Times New Roman" w:hAnsi="Times New Roman" w:cs="Times New Roman"/>
+        </w:rPr>
+        <w:t xml:space="preserve"> follows a three-tier client-server architecture:</w:t>
+      </w:r>
+    </w:p>
+    <w:p>
+      <w:pPr>
+        <w:rPr>
+          <w:rFonts w:ascii="Times New Roman" w:hAnsi="Times New Roman" w:cs="Times New Roman"/>
+        </w:rPr>
+      </w:pPr>
+    </w:p>
+    <w:p>
+      <w:pPr>
+        <w:rPr>
+          <w:rFonts w:ascii="Times New Roman" w:hAnsi="Times New Roman" w:cs="Times New Roman"/>
+        </w:rPr>
+      </w:pPr>
+      <w:r>
+        <w:rPr>
+          <w:rFonts w:ascii="Times New Roman" w:hAnsi="Times New Roman" w:cs="Times New Roman"/>
+        </w:rPr>
+        <w:t xml:space="preserve">   Angular (Frontend) → REST API (ASP.NET Core) → SQL Server (Database)</w:t>
+      </w:r>
+    </w:p>
+    <w:p>
+      <w:pPr>
+        <w:rPr>
+          <w:rFonts w:ascii="Times New Roman" w:hAnsi="Times New Roman" w:cs="Times New Roman"/>
+        </w:rPr>
+      </w:pPr>
+    </w:p>
+    <w:p>
+      <w:pPr>
+        <w:rPr>
+          <w:rFonts w:ascii="Times New Roman" w:hAnsi="Times New Roman" w:cs="Times New Roman"/>
+        </w:rPr>
+      </w:pPr>
+      <w:r>
+        <w:rPr>
+          <w:rFonts w:ascii="Times New Roman" w:hAnsi="Times New Roman" w:cs="Times New Roman"/>
+        </w:rPr>
+        <w:t xml:space="preserve">The backend is built using ASP.NET Core (.NET 10) following Clean </w:t>
+      </w:r>
+    </w:p>
+    <w:p>
+      <w:pPr>
+        <w:rPr>
+          <w:rFonts w:ascii="Times New Roman" w:hAnsi="Times New Roman" w:cs="Times New Roman"/>
+        </w:rPr>
+      </w:pPr>
+      <w:r>
+        <w:rPr>
+          <w:rFonts w:ascii="Times New Roman" w:hAnsi="Times New Roman" w:cs="Times New Roman"/>
+        </w:rPr>
+        <w:t xml:space="preserve">Architecture principles, with clear separation between the Domain, </w:t>
+      </w:r>
+    </w:p>
+    <w:p>
+      <w:pPr>
+        <w:rPr>
+          <w:rFonts w:ascii="Times New Roman" w:hAnsi="Times New Roman" w:cs="Times New Roman"/>
+        </w:rPr>
+      </w:pPr>
+      <w:r>
+        <w:rPr>
+          <w:rFonts w:ascii="Times New Roman" w:hAnsi="Times New Roman" w:cs="Times New Roman"/>
+        </w:rPr>
+        <w:t xml:space="preserve">Application, Infrastructure, and API layers. This ensures the system is </w:t>
+      </w:r>
+    </w:p>
+    <w:p>
+      <w:pPr>
+        <w:rPr>
+          <w:rFonts w:ascii="Times New Roman" w:hAnsi="Times New Roman" w:cs="Times New Roman"/>
+        </w:rPr>
+      </w:pPr>
+      <w:r>
+        <w:rPr>
+          <w:rFonts w:ascii="Times New Roman" w:hAnsi="Times New Roman" w:cs="Times New Roman"/>
+        </w:rPr>
+        <w:t>maintainable, testable, and scalable for future enhancements.</w:t>
+      </w:r>
+    </w:p>
+    <w:p>
+      <w:pPr>
+        <w:rPr>
+          <w:rFonts w:ascii="Times New Roman" w:hAnsi="Times New Roman" w:cs="Times New Roman"/>
+        </w:rPr>
+      </w:pPr>
+    </w:p>
+    <w:p>
+      <w:pPr>
+        <w:rPr>
+          <w:rFonts w:ascii="Times New Roman" w:hAnsi="Times New Roman" w:cs="Times New Roman"/>
+        </w:rPr>
+      </w:pPr>
+      <w:r>
+        <w:rPr>
+          <w:rFonts w:ascii="Times New Roman" w:hAnsi="Times New Roman" w:cs="Times New Roman"/>
+        </w:rPr>
+        <w:t xml:space="preserve">The frontend is built using Angular, providing a responsive, </w:t>
+      </w:r>
+    </w:p>
+    <w:p>
+      <w:pPr>
+        <w:rPr>
+          <w:rFonts w:ascii="Times New Roman" w:hAnsi="Times New Roman" w:cs="Times New Roman"/>
+        </w:rPr>
+      </w:pPr>
+      <w:r>
+        <w:rPr>
+          <w:rFonts w:ascii="Times New Roman" w:hAnsi="Times New Roman" w:cs="Times New Roman"/>
+        </w:rPr>
+        <w:t>single-page application experience for end users across devices.</w:t>
+      </w:r>
+    </w:p>
+    <w:p>
+      <w:pPr>
+        <w:rPr>
+          <w:rFonts w:ascii="Times New Roman" w:hAnsi="Times New Roman" w:cs="Times New Roman"/>
+        </w:rPr>
+      </w:pPr>
+    </w:p>
+    <w:p>
+      <w:pPr>
+        <w:rPr>
+          <w:rFonts w:ascii="Times New Roman" w:hAnsi="Times New Roman" w:cs="Times New Roman"/>
+        </w:rPr>
+      </w:pPr>
+      <w:r>
+        <w:rPr>
+          <w:rFonts w:ascii="Times New Roman" w:hAnsi="Times New Roman" w:cs="Times New Roman"/>
+        </w:rPr>
+        <w:t xml:space="preserve">Authentication and authorization are handled through JSON Web Tokens </w:t>
+      </w:r>
+    </w:p>
+    <w:p>
+      <w:pPr>
+        <w:rPr>
+          <w:rFonts w:ascii="Times New Roman" w:hAnsi="Times New Roman" w:cs="Times New Roman"/>
+        </w:rPr>
+      </w:pPr>
+      <w:r>
+        <w:rPr>
+          <w:rFonts w:ascii="Times New Roman" w:hAnsi="Times New Roman" w:cs="Times New Roman"/>
+        </w:rPr>
+        <w:t>(JWT), ensuring secure, stateless access control based on user roles.</w:t>
+      </w:r>
+    </w:p>
+    <w:p>
+      <w:pPr>
+        <w:rPr>
+          <w:rFonts w:ascii="Times New Roman" w:hAnsi="Times New Roman" w:cs="Times New Roman"/>
+        </w:rPr>
+      </w:pPr>
     </w:p>
     <w:p>
       <w:pPr>
@@ -477,6 +1149,539 @@
           <w:rFonts w:ascii="Times New Roman" w:hAnsi="Times New Roman" w:cs="Times New Roman"/>
         </w:rPr>
       </w:pPr>
+      <w:proofErr w:type="spellStart"/>
+      <w:r>
+        <w:rPr>
+          <w:rFonts w:ascii="Times New Roman" w:hAnsi="Times New Roman" w:cs="Times New Roman"/>
+        </w:rPr>
+        <w:t>NexusFlow</w:t>
+      </w:r>
+      <w:proofErr w:type="spellEnd"/>
+      <w:r>
+        <w:rPr>
+          <w:rFonts w:ascii="Times New Roman" w:hAnsi="Times New Roman" w:cs="Times New Roman"/>
+        </w:rPr>
+        <w:t xml:space="preserve"> consists of the following core functional modules:</w:t>
+      </w:r>
+    </w:p>
+    <w:p>
+      <w:pPr>
+        <w:rPr>
+          <w:rFonts w:ascii="Times New Roman" w:hAnsi="Times New Roman" w:cs="Times New Roman"/>
+        </w:rPr>
+      </w:pPr>
+    </w:p>
+    <w:p>
+      <w:pPr>
+        <w:rPr>
+          <w:rFonts w:ascii="Times New Roman" w:hAnsi="Times New Roman" w:cs="Times New Roman"/>
+        </w:rPr>
+      </w:pPr>
+      <w:r>
+        <w:rPr>
+          <w:rFonts w:ascii="Times New Roman" w:hAnsi="Times New Roman" w:cs="Times New Roman"/>
+        </w:rPr>
+        <w:t>1. Authentication &amp; Authorization Module</w:t>
+      </w:r>
+    </w:p>
+    <w:p>
+      <w:pPr>
+        <w:rPr>
+          <w:rFonts w:ascii="Times New Roman" w:hAnsi="Times New Roman" w:cs="Times New Roman"/>
+        </w:rPr>
+      </w:pPr>
+      <w:r>
+        <w:rPr>
+          <w:rFonts w:ascii="Times New Roman" w:hAnsi="Times New Roman" w:cs="Times New Roman"/>
+        </w:rPr>
+        <w:t xml:space="preserve">   Users: All Users</w:t>
+      </w:r>
+    </w:p>
+    <w:p>
+      <w:pPr>
+        <w:rPr>
+          <w:rFonts w:ascii="Times New Roman" w:hAnsi="Times New Roman" w:cs="Times New Roman"/>
+        </w:rPr>
+      </w:pPr>
+      <w:r>
+        <w:rPr>
+          <w:rFonts w:ascii="Times New Roman" w:hAnsi="Times New Roman" w:cs="Times New Roman"/>
+        </w:rPr>
+        <w:t xml:space="preserve">   Allows users to register, log in, and securely access the system </w:t>
+      </w:r>
+    </w:p>
+    <w:p>
+      <w:pPr>
+        <w:rPr>
+          <w:rFonts w:ascii="Times New Roman" w:hAnsi="Times New Roman" w:cs="Times New Roman"/>
+        </w:rPr>
+      </w:pPr>
+      <w:r>
+        <w:rPr>
+          <w:rFonts w:ascii="Times New Roman" w:hAnsi="Times New Roman" w:cs="Times New Roman"/>
+        </w:rPr>
+        <w:t xml:space="preserve">   using JWT-based authentication. Supports role-based access control </w:t>
+      </w:r>
+    </w:p>
+    <w:p>
+      <w:pPr>
+        <w:rPr>
+          <w:rFonts w:ascii="Times New Roman" w:hAnsi="Times New Roman" w:cs="Times New Roman"/>
+        </w:rPr>
+      </w:pPr>
+      <w:r>
+        <w:rPr>
+          <w:rFonts w:ascii="Times New Roman" w:hAnsi="Times New Roman" w:cs="Times New Roman"/>
+        </w:rPr>
+        <w:t xml:space="preserve">   for Admin, Project Manager, Team Member, and Client roles.</w:t>
+      </w:r>
+    </w:p>
+    <w:p>
+      <w:pPr>
+        <w:rPr>
+          <w:rFonts w:ascii="Times New Roman" w:hAnsi="Times New Roman" w:cs="Times New Roman"/>
+        </w:rPr>
+      </w:pPr>
+    </w:p>
+    <w:p>
+      <w:pPr>
+        <w:rPr>
+          <w:rFonts w:ascii="Times New Roman" w:hAnsi="Times New Roman" w:cs="Times New Roman"/>
+        </w:rPr>
+      </w:pPr>
+      <w:r>
+        <w:rPr>
+          <w:rFonts w:ascii="Times New Roman" w:hAnsi="Times New Roman" w:cs="Times New Roman"/>
+        </w:rPr>
+        <w:t>2. User Management Module</w:t>
+      </w:r>
+    </w:p>
+    <w:p>
+      <w:pPr>
+        <w:rPr>
+          <w:rFonts w:ascii="Times New Roman" w:hAnsi="Times New Roman" w:cs="Times New Roman"/>
+        </w:rPr>
+      </w:pPr>
+      <w:r>
+        <w:rPr>
+          <w:rFonts w:ascii="Times New Roman" w:hAnsi="Times New Roman" w:cs="Times New Roman"/>
+        </w:rPr>
+        <w:t xml:space="preserve">   Users: Admin</w:t>
+      </w:r>
+    </w:p>
+    <w:p>
+      <w:pPr>
+        <w:rPr>
+          <w:rFonts w:ascii="Times New Roman" w:hAnsi="Times New Roman" w:cs="Times New Roman"/>
+        </w:rPr>
+      </w:pPr>
+      <w:r>
+        <w:rPr>
+          <w:rFonts w:ascii="Times New Roman" w:hAnsi="Times New Roman" w:cs="Times New Roman"/>
+        </w:rPr>
+        <w:t xml:space="preserve">   Allows administrators to manage user accounts, view user profiles, </w:t>
+      </w:r>
+    </w:p>
+    <w:p>
+      <w:pPr>
+        <w:rPr>
+          <w:rFonts w:ascii="Times New Roman" w:hAnsi="Times New Roman" w:cs="Times New Roman"/>
+        </w:rPr>
+      </w:pPr>
+      <w:r>
+        <w:rPr>
+          <w:rFonts w:ascii="Times New Roman" w:hAnsi="Times New Roman" w:cs="Times New Roman"/>
+        </w:rPr>
+        <w:t xml:space="preserve">   and control account status.</w:t>
+      </w:r>
+    </w:p>
+    <w:p>
+      <w:pPr>
+        <w:rPr>
+          <w:rFonts w:ascii="Times New Roman" w:hAnsi="Times New Roman" w:cs="Times New Roman"/>
+        </w:rPr>
+      </w:pPr>
+    </w:p>
+    <w:p>
+      <w:pPr>
+        <w:rPr>
+          <w:rFonts w:ascii="Times New Roman" w:hAnsi="Times New Roman" w:cs="Times New Roman"/>
+        </w:rPr>
+      </w:pPr>
+      <w:r>
+        <w:rPr>
+          <w:rFonts w:ascii="Times New Roman" w:hAnsi="Times New Roman" w:cs="Times New Roman"/>
+        </w:rPr>
+        <w:t>3. Organization Management Module</w:t>
+      </w:r>
+    </w:p>
+    <w:p>
+      <w:pPr>
+        <w:rPr>
+          <w:rFonts w:ascii="Times New Roman" w:hAnsi="Times New Roman" w:cs="Times New Roman"/>
+        </w:rPr>
+      </w:pPr>
+      <w:r>
+        <w:rPr>
+          <w:rFonts w:ascii="Times New Roman" w:hAnsi="Times New Roman" w:cs="Times New Roman"/>
+        </w:rPr>
+        <w:t xml:space="preserve">   Users: Admin</w:t>
+      </w:r>
+    </w:p>
+    <w:p>
+      <w:pPr>
+        <w:rPr>
+          <w:rFonts w:ascii="Times New Roman" w:hAnsi="Times New Roman" w:cs="Times New Roman"/>
+        </w:rPr>
+      </w:pPr>
+      <w:r>
+        <w:rPr>
+          <w:rFonts w:ascii="Times New Roman" w:hAnsi="Times New Roman" w:cs="Times New Roman"/>
+        </w:rPr>
+        <w:t xml:space="preserve">   Allows creation and management of organizations that group projects </w:t>
+      </w:r>
+    </w:p>
+    <w:p>
+      <w:pPr>
+        <w:rPr>
+          <w:rFonts w:ascii="Times New Roman" w:hAnsi="Times New Roman" w:cs="Times New Roman"/>
+        </w:rPr>
+      </w:pPr>
+      <w:r>
+        <w:rPr>
+          <w:rFonts w:ascii="Times New Roman" w:hAnsi="Times New Roman" w:cs="Times New Roman"/>
+        </w:rPr>
+        <w:t xml:space="preserve">   and users under a single entity.</w:t>
+      </w:r>
+    </w:p>
+    <w:p>
+      <w:pPr>
+        <w:rPr>
+          <w:rFonts w:ascii="Times New Roman" w:hAnsi="Times New Roman" w:cs="Times New Roman"/>
+        </w:rPr>
+      </w:pPr>
+    </w:p>
+    <w:p>
+      <w:pPr>
+        <w:rPr>
+          <w:rFonts w:ascii="Times New Roman" w:hAnsi="Times New Roman" w:cs="Times New Roman"/>
+        </w:rPr>
+      </w:pPr>
+      <w:r>
+        <w:rPr>
+          <w:rFonts w:ascii="Times New Roman" w:hAnsi="Times New Roman" w:cs="Times New Roman"/>
+        </w:rPr>
+        <w:t>4. Project Management Module</w:t>
+      </w:r>
+    </w:p>
+    <w:p>
+      <w:pPr>
+        <w:rPr>
+          <w:rFonts w:ascii="Times New Roman" w:hAnsi="Times New Roman" w:cs="Times New Roman"/>
+        </w:rPr>
+      </w:pPr>
+      <w:r>
+        <w:rPr>
+          <w:rFonts w:ascii="Times New Roman" w:hAnsi="Times New Roman" w:cs="Times New Roman"/>
+        </w:rPr>
+        <w:t xml:space="preserve">   Users: Admin, Project Manager</w:t>
+      </w:r>
+    </w:p>
+    <w:p>
+      <w:pPr>
+        <w:rPr>
+          <w:rFonts w:ascii="Times New Roman" w:hAnsi="Times New Roman" w:cs="Times New Roman"/>
+        </w:rPr>
+      </w:pPr>
+      <w:r>
+        <w:rPr>
+          <w:rFonts w:ascii="Times New Roman" w:hAnsi="Times New Roman" w:cs="Times New Roman"/>
+        </w:rPr>
+        <w:t xml:space="preserve">   Allows creation, updating, and tracking of projects including </w:t>
+      </w:r>
+    </w:p>
+    <w:p>
+      <w:pPr>
+        <w:rPr>
+          <w:rFonts w:ascii="Times New Roman" w:hAnsi="Times New Roman" w:cs="Times New Roman"/>
+        </w:rPr>
+      </w:pPr>
+      <w:r>
+        <w:rPr>
+          <w:rFonts w:ascii="Times New Roman" w:hAnsi="Times New Roman" w:cs="Times New Roman"/>
+        </w:rPr>
+        <w:t xml:space="preserve">   project status, timelines, and assigned members.</w:t>
+      </w:r>
+    </w:p>
+    <w:p>
+      <w:pPr>
+        <w:rPr>
+          <w:rFonts w:ascii="Times New Roman" w:hAnsi="Times New Roman" w:cs="Times New Roman"/>
+        </w:rPr>
+      </w:pPr>
+    </w:p>
+    <w:p>
+      <w:pPr>
+        <w:rPr>
+          <w:rFonts w:ascii="Times New Roman" w:hAnsi="Times New Roman" w:cs="Times New Roman"/>
+        </w:rPr>
+      </w:pPr>
+      <w:r>
+        <w:rPr>
+          <w:rFonts w:ascii="Times New Roman" w:hAnsi="Times New Roman" w:cs="Times New Roman"/>
+        </w:rPr>
+        <w:t>5. Task Management Module</w:t>
+      </w:r>
+    </w:p>
+    <w:p>
+      <w:pPr>
+        <w:rPr>
+          <w:rFonts w:ascii="Times New Roman" w:hAnsi="Times New Roman" w:cs="Times New Roman"/>
+        </w:rPr>
+      </w:pPr>
+      <w:r>
+        <w:rPr>
+          <w:rFonts w:ascii="Times New Roman" w:hAnsi="Times New Roman" w:cs="Times New Roman"/>
+        </w:rPr>
+        <w:t xml:space="preserve">   Users: Project Manager, Team Member</w:t>
+      </w:r>
+    </w:p>
+    <w:p>
+      <w:pPr>
+        <w:rPr>
+          <w:rFonts w:ascii="Times New Roman" w:hAnsi="Times New Roman" w:cs="Times New Roman"/>
+        </w:rPr>
+      </w:pPr>
+      <w:r>
+        <w:rPr>
+          <w:rFonts w:ascii="Times New Roman" w:hAnsi="Times New Roman" w:cs="Times New Roman"/>
+        </w:rPr>
+        <w:t xml:space="preserve">   Allows creation and assignment of tasks within a project, including </w:t>
+      </w:r>
+    </w:p>
+    <w:p>
+      <w:pPr>
+        <w:rPr>
+          <w:rFonts w:ascii="Times New Roman" w:hAnsi="Times New Roman" w:cs="Times New Roman"/>
+        </w:rPr>
+      </w:pPr>
+      <w:r>
+        <w:rPr>
+          <w:rFonts w:ascii="Times New Roman" w:hAnsi="Times New Roman" w:cs="Times New Roman"/>
+        </w:rPr>
+        <w:t xml:space="preserve">   priority levels, due dates, and status tracking (To Do, In Progress, </w:t>
+      </w:r>
+    </w:p>
+    <w:p>
+      <w:pPr>
+        <w:rPr>
+          <w:rFonts w:ascii="Times New Roman" w:hAnsi="Times New Roman" w:cs="Times New Roman"/>
+        </w:rPr>
+      </w:pPr>
+      <w:r>
+        <w:rPr>
+          <w:rFonts w:ascii="Times New Roman" w:hAnsi="Times New Roman" w:cs="Times New Roman"/>
+        </w:rPr>
+        <w:t xml:space="preserve">   In Review, Done).</w:t>
+      </w:r>
+    </w:p>
+    <w:p>
+      <w:pPr>
+        <w:rPr>
+          <w:rFonts w:ascii="Times New Roman" w:hAnsi="Times New Roman" w:cs="Times New Roman"/>
+        </w:rPr>
+      </w:pPr>
+    </w:p>
+    <w:p>
+      <w:pPr>
+        <w:rPr>
+          <w:rFonts w:ascii="Times New Roman" w:hAnsi="Times New Roman" w:cs="Times New Roman"/>
+        </w:rPr>
+      </w:pPr>
+      <w:r>
+        <w:rPr>
+          <w:rFonts w:ascii="Times New Roman" w:hAnsi="Times New Roman" w:cs="Times New Roman"/>
+        </w:rPr>
+        <w:t>6. Comment &amp; Collaboration Module</w:t>
+      </w:r>
+    </w:p>
+    <w:p>
+      <w:pPr>
+        <w:rPr>
+          <w:rFonts w:ascii="Times New Roman" w:hAnsi="Times New Roman" w:cs="Times New Roman"/>
+        </w:rPr>
+      </w:pPr>
+      <w:r>
+        <w:rPr>
+          <w:rFonts w:ascii="Times New Roman" w:hAnsi="Times New Roman" w:cs="Times New Roman"/>
+        </w:rPr>
+        <w:t xml:space="preserve">   Users: Project Manager, Team Member</w:t>
+      </w:r>
+    </w:p>
+    <w:p>
+      <w:pPr>
+        <w:rPr>
+          <w:rFonts w:ascii="Times New Roman" w:hAnsi="Times New Roman" w:cs="Times New Roman"/>
+        </w:rPr>
+      </w:pPr>
+      <w:r>
+        <w:rPr>
+          <w:rFonts w:ascii="Times New Roman" w:hAnsi="Times New Roman" w:cs="Times New Roman"/>
+        </w:rPr>
+        <w:lastRenderedPageBreak/>
+        <w:t xml:space="preserve">   Allows team members to discuss specific tasks through task-linked </w:t>
+      </w:r>
+    </w:p>
+    <w:p>
+      <w:pPr>
+        <w:rPr>
+          <w:rFonts w:ascii="Times New Roman" w:hAnsi="Times New Roman" w:cs="Times New Roman"/>
+        </w:rPr>
+      </w:pPr>
+      <w:r>
+        <w:rPr>
+          <w:rFonts w:ascii="Times New Roman" w:hAnsi="Times New Roman" w:cs="Times New Roman"/>
+        </w:rPr>
+        <w:t xml:space="preserve">   comments, keeping all communication contextual to the relevant work </w:t>
+      </w:r>
+    </w:p>
+    <w:p>
+      <w:pPr>
+        <w:rPr>
+          <w:rFonts w:ascii="Times New Roman" w:hAnsi="Times New Roman" w:cs="Times New Roman"/>
+        </w:rPr>
+      </w:pPr>
+      <w:r>
+        <w:rPr>
+          <w:rFonts w:ascii="Times New Roman" w:hAnsi="Times New Roman" w:cs="Times New Roman"/>
+        </w:rPr>
+        <w:t xml:space="preserve">   item.</w:t>
+      </w:r>
+    </w:p>
+    <w:p>
+      <w:pPr>
+        <w:rPr>
+          <w:rFonts w:ascii="Times New Roman" w:hAnsi="Times New Roman" w:cs="Times New Roman"/>
+        </w:rPr>
+      </w:pPr>
+    </w:p>
+    <w:p>
+      <w:pPr>
+        <w:rPr>
+          <w:rFonts w:ascii="Times New Roman" w:hAnsi="Times New Roman" w:cs="Times New Roman"/>
+        </w:rPr>
+      </w:pPr>
+      <w:r>
+        <w:rPr>
+          <w:rFonts w:ascii="Times New Roman" w:hAnsi="Times New Roman" w:cs="Times New Roman"/>
+        </w:rPr>
+        <w:t>7. Notification Module</w:t>
+      </w:r>
+    </w:p>
+    <w:p>
+      <w:pPr>
+        <w:rPr>
+          <w:rFonts w:ascii="Times New Roman" w:hAnsi="Times New Roman" w:cs="Times New Roman"/>
+        </w:rPr>
+      </w:pPr>
+      <w:r>
+        <w:rPr>
+          <w:rFonts w:ascii="Times New Roman" w:hAnsi="Times New Roman" w:cs="Times New Roman"/>
+        </w:rPr>
+        <w:t xml:space="preserve">   Users: All Users</w:t>
+      </w:r>
+    </w:p>
+    <w:p>
+      <w:pPr>
+        <w:rPr>
+          <w:rFonts w:ascii="Times New Roman" w:hAnsi="Times New Roman" w:cs="Times New Roman"/>
+        </w:rPr>
+      </w:pPr>
+      <w:r>
+        <w:rPr>
+          <w:rFonts w:ascii="Times New Roman" w:hAnsi="Times New Roman" w:cs="Times New Roman"/>
+        </w:rPr>
+        <w:t xml:space="preserve">   Automatically notifies users of important events such as task </w:t>
+      </w:r>
+    </w:p>
+    <w:p>
+      <w:pPr>
+        <w:rPr>
+          <w:rFonts w:ascii="Times New Roman" w:hAnsi="Times New Roman" w:cs="Times New Roman"/>
+        </w:rPr>
+      </w:pPr>
+      <w:r>
+        <w:rPr>
+          <w:rFonts w:ascii="Times New Roman" w:hAnsi="Times New Roman" w:cs="Times New Roman"/>
+        </w:rPr>
+        <w:t xml:space="preserve">   assignments, ensuring no critical update is missed.</w:t>
+      </w:r>
+    </w:p>
+    <w:p>
+      <w:pPr>
+        <w:rPr>
+          <w:rFonts w:ascii="Times New Roman" w:hAnsi="Times New Roman" w:cs="Times New Roman"/>
+        </w:rPr>
+      </w:pPr>
+    </w:p>
+    <w:p>
+      <w:pPr>
+        <w:rPr>
+          <w:rFonts w:ascii="Times New Roman" w:hAnsi="Times New Roman" w:cs="Times New Roman"/>
+        </w:rPr>
+      </w:pPr>
+      <w:r>
+        <w:rPr>
+          <w:rFonts w:ascii="Times New Roman" w:hAnsi="Times New Roman" w:cs="Times New Roman"/>
+        </w:rPr>
+        <w:t>8. Dashboard &amp; Reporting Module</w:t>
+      </w:r>
+    </w:p>
+    <w:p>
+      <w:pPr>
+        <w:rPr>
+          <w:rFonts w:ascii="Times New Roman" w:hAnsi="Times New Roman" w:cs="Times New Roman"/>
+        </w:rPr>
+      </w:pPr>
+      <w:r>
+        <w:rPr>
+          <w:rFonts w:ascii="Times New Roman" w:hAnsi="Times New Roman" w:cs="Times New Roman"/>
+        </w:rPr>
+        <w:t xml:space="preserve">   Users: Admin, Project Manager, Client</w:t>
+      </w:r>
+    </w:p>
+    <w:p>
+      <w:pPr>
+        <w:rPr>
+          <w:rFonts w:ascii="Times New Roman" w:hAnsi="Times New Roman" w:cs="Times New Roman"/>
+        </w:rPr>
+      </w:pPr>
+      <w:r>
+        <w:rPr>
+          <w:rFonts w:ascii="Times New Roman" w:hAnsi="Times New Roman" w:cs="Times New Roman"/>
+        </w:rPr>
+        <w:t xml:space="preserve">   Provides a consolidated view of project statistics, task progress, </w:t>
+      </w:r>
+    </w:p>
+    <w:p>
+      <w:pPr>
+        <w:rPr>
+          <w:rFonts w:ascii="Times New Roman" w:hAnsi="Times New Roman" w:cs="Times New Roman"/>
+        </w:rPr>
+      </w:pPr>
+      <w:r>
+        <w:rPr>
+          <w:rFonts w:ascii="Times New Roman" w:hAnsi="Times New Roman" w:cs="Times New Roman"/>
+        </w:rPr>
+        <w:t xml:space="preserve">   and team performance.</w:t>
+      </w:r>
+    </w:p>
+    <w:p>
+      <w:pPr>
+        <w:rPr>
+          <w:rFonts w:ascii="Times New Roman" w:hAnsi="Times New Roman" w:cs="Times New Roman"/>
+        </w:rPr>
+      </w:pPr>
     </w:p>
     <w:p>
       <w:pPr>
@@ -514,6 +1719,104 @@
         <w:rPr>
           <w:rFonts w:ascii="Times New Roman" w:hAnsi="Times New Roman" w:cs="Times New Roman"/>
         </w:rPr>
+        <w:tab/>
+      </w:r>
+      <w:r>
+        <w:rPr>
+          <w:rFonts w:ascii="Times New Roman" w:hAnsi="Times New Roman" w:cs="Times New Roman"/>
+        </w:rPr>
+        <w:t xml:space="preserve">Processor:    Intel Core i5 / AMD </w:t>
+      </w:r>
+      <w:proofErr w:type="spellStart"/>
+      <w:r>
+        <w:rPr>
+          <w:rFonts w:ascii="Times New Roman" w:hAnsi="Times New Roman" w:cs="Times New Roman"/>
+        </w:rPr>
+        <w:t>Ryzen</w:t>
+      </w:r>
+      <w:proofErr w:type="spellEnd"/>
+      <w:r>
+        <w:rPr>
+          <w:rFonts w:ascii="Times New Roman" w:hAnsi="Times New Roman" w:cs="Times New Roman"/>
+        </w:rPr>
+        <w:t xml:space="preserve"> 5 or higher</w:t>
+      </w:r>
+    </w:p>
+    <w:p>
+      <w:pPr>
+        <w:rPr>
+          <w:rFonts w:ascii="Times New Roman" w:hAnsi="Times New Roman" w:cs="Times New Roman"/>
+        </w:rPr>
+      </w:pPr>
+      <w:r>
+        <w:rPr>
+          <w:rFonts w:ascii="Times New Roman" w:hAnsi="Times New Roman" w:cs="Times New Roman"/>
+        </w:rPr>
+        <w:t>RAM:          8 GB minimum (16 GB recommended)</w:t>
+      </w:r>
+    </w:p>
+    <w:p>
+      <w:pPr>
+        <w:rPr>
+          <w:rFonts w:ascii="Times New Roman" w:hAnsi="Times New Roman" w:cs="Times New Roman"/>
+        </w:rPr>
+      </w:pPr>
+      <w:r>
+        <w:rPr>
+          <w:rFonts w:ascii="Times New Roman" w:hAnsi="Times New Roman" w:cs="Times New Roman"/>
+        </w:rPr>
+        <w:t>Storage:      100 GB free disk space (SSD preferred)</w:t>
+      </w:r>
+    </w:p>
+    <w:p>
+      <w:pPr>
+        <w:rPr>
+          <w:rFonts w:ascii="Times New Roman" w:hAnsi="Times New Roman" w:cs="Times New Roman"/>
+        </w:rPr>
+      </w:pPr>
+      <w:r>
+        <w:rPr>
+          <w:rFonts w:ascii="Times New Roman" w:hAnsi="Times New Roman" w:cs="Times New Roman"/>
+        </w:rPr>
+        <w:t>Display:      1366 x 768 resolution or higher</w:t>
+      </w:r>
+    </w:p>
+    <w:p>
+      <w:pPr>
+        <w:rPr>
+          <w:rFonts w:ascii="Times New Roman" w:hAnsi="Times New Roman" w:cs="Times New Roman"/>
+        </w:rPr>
+      </w:pPr>
+      <w:r>
+        <w:rPr>
+          <w:rFonts w:ascii="Times New Roman" w:hAnsi="Times New Roman" w:cs="Times New Roman"/>
+        </w:rPr>
+        <w:t>Operating</w:t>
+      </w:r>
+    </w:p>
+    <w:p>
+      <w:pPr>
+        <w:rPr>
+          <w:rFonts w:ascii="Times New Roman" w:hAnsi="Times New Roman" w:cs="Times New Roman"/>
+        </w:rPr>
+      </w:pPr>
+      <w:r>
+        <w:rPr>
+          <w:rFonts w:ascii="Times New Roman" w:hAnsi="Times New Roman" w:cs="Times New Roman"/>
+        </w:rPr>
+        <w:t>System:       Windows 10/11 (64-bit)</w:t>
+      </w:r>
+    </w:p>
+    <w:p>
+      <w:pPr>
+        <w:rPr>
+          <w:rFonts w:ascii="Times New Roman" w:hAnsi="Times New Roman" w:cs="Times New Roman"/>
+        </w:rPr>
+      </w:pPr>
+      <w:r>
+        <w:rPr>
+          <w:rFonts w:ascii="Times New Roman" w:hAnsi="Times New Roman" w:cs="Times New Roman"/>
+        </w:rPr>
         <w:t xml:space="preserve">   5.2 Software Specifications</w:t>
       </w:r>
     </w:p>
@@ -523,6 +1826,254 @@
           <w:rFonts w:ascii="Times New Roman" w:hAnsi="Times New Roman" w:cs="Times New Roman"/>
         </w:rPr>
       </w:pPr>
+      <w:r>
+        <w:rPr>
+          <w:rFonts w:ascii="Times New Roman" w:hAnsi="Times New Roman" w:cs="Times New Roman"/>
+        </w:rPr>
+        <w:t xml:space="preserve">Frontend:           Angular, TypeScript, HTML5, CSS3, Bootstrap, </w:t>
+      </w:r>
+    </w:p>
+    <w:p>
+      <w:pPr>
+        <w:rPr>
+          <w:rFonts w:ascii="Times New Roman" w:hAnsi="Times New Roman" w:cs="Times New Roman"/>
+        </w:rPr>
+      </w:pPr>
+      <w:r>
+        <w:rPr>
+          <w:rFonts w:ascii="Times New Roman" w:hAnsi="Times New Roman" w:cs="Times New Roman"/>
+        </w:rPr>
+        <w:t xml:space="preserve">                     Angular Material</w:t>
+      </w:r>
+    </w:p>
+    <w:p>
+      <w:pPr>
+        <w:rPr>
+          <w:rFonts w:ascii="Times New Roman" w:hAnsi="Times New Roman" w:cs="Times New Roman"/>
+        </w:rPr>
+      </w:pPr>
+    </w:p>
+    <w:p>
+      <w:pPr>
+        <w:rPr>
+          <w:rFonts w:ascii="Times New Roman" w:hAnsi="Times New Roman" w:cs="Times New Roman"/>
+        </w:rPr>
+      </w:pPr>
+      <w:r>
+        <w:rPr>
+          <w:rFonts w:ascii="Times New Roman" w:hAnsi="Times New Roman" w:cs="Times New Roman"/>
+        </w:rPr>
+        <w:t xml:space="preserve">Backend:            ASP.NET Core (.NET 10), C#, Entity Framework Core, </w:t>
+      </w:r>
+    </w:p>
+    <w:p>
+      <w:pPr>
+        <w:rPr>
+          <w:rFonts w:ascii="Times New Roman" w:hAnsi="Times New Roman" w:cs="Times New Roman"/>
+        </w:rPr>
+      </w:pPr>
+      <w:r>
+        <w:rPr>
+          <w:rFonts w:ascii="Times New Roman" w:hAnsi="Times New Roman" w:cs="Times New Roman"/>
+        </w:rPr>
+        <w:t xml:space="preserve">                     </w:t>
+      </w:r>
+      <w:proofErr w:type="spellStart"/>
+      <w:r>
+        <w:rPr>
+          <w:rFonts w:ascii="Times New Roman" w:hAnsi="Times New Roman" w:cs="Times New Roman"/>
+        </w:rPr>
+        <w:t>AutoMapper</w:t>
+      </w:r>
+      <w:proofErr w:type="spellEnd"/>
+      <w:r>
+        <w:rPr>
+          <w:rFonts w:ascii="Times New Roman" w:hAnsi="Times New Roman" w:cs="Times New Roman"/>
+        </w:rPr>
+        <w:t xml:space="preserve">, </w:t>
+      </w:r>
+      <w:proofErr w:type="spellStart"/>
+      <w:r>
+        <w:rPr>
+          <w:rFonts w:ascii="Times New Roman" w:hAnsi="Times New Roman" w:cs="Times New Roman"/>
+        </w:rPr>
+        <w:t>FluentValidation</w:t>
+      </w:r>
+      <w:proofErr w:type="spellEnd"/>
+    </w:p>
+    <w:p>
+      <w:pPr>
+        <w:rPr>
+          <w:rFonts w:ascii="Times New Roman" w:hAnsi="Times New Roman" w:cs="Times New Roman"/>
+        </w:rPr>
+      </w:pPr>
+    </w:p>
+    <w:p>
+      <w:pPr>
+        <w:rPr>
+          <w:rFonts w:ascii="Times New Roman" w:hAnsi="Times New Roman" w:cs="Times New Roman"/>
+        </w:rPr>
+      </w:pPr>
+      <w:r>
+        <w:rPr>
+          <w:rFonts w:ascii="Times New Roman" w:hAnsi="Times New Roman" w:cs="Times New Roman"/>
+        </w:rPr>
+        <w:t>Database:           Microsoft SQL Server 2022 (Developer Edition)</w:t>
+      </w:r>
+    </w:p>
+    <w:p>
+      <w:pPr>
+        <w:rPr>
+          <w:rFonts w:ascii="Times New Roman" w:hAnsi="Times New Roman" w:cs="Times New Roman"/>
+        </w:rPr>
+      </w:pPr>
+    </w:p>
+    <w:p>
+      <w:pPr>
+        <w:rPr>
+          <w:rFonts w:ascii="Times New Roman" w:hAnsi="Times New Roman" w:cs="Times New Roman"/>
+        </w:rPr>
+      </w:pPr>
+      <w:r>
+        <w:rPr>
+          <w:rFonts w:ascii="Times New Roman" w:hAnsi="Times New Roman" w:cs="Times New Roman"/>
+        </w:rPr>
+        <w:t>Authentication:     JSON Web Tokens (JWT)</w:t>
+      </w:r>
+    </w:p>
+    <w:p>
+      <w:pPr>
+        <w:rPr>
+          <w:rFonts w:ascii="Times New Roman" w:hAnsi="Times New Roman" w:cs="Times New Roman"/>
+        </w:rPr>
+      </w:pPr>
+    </w:p>
+    <w:p>
+      <w:pPr>
+        <w:rPr>
+          <w:rFonts w:ascii="Times New Roman" w:hAnsi="Times New Roman" w:cs="Times New Roman"/>
+        </w:rPr>
+      </w:pPr>
+      <w:r>
+        <w:rPr>
+          <w:rFonts w:ascii="Times New Roman" w:hAnsi="Times New Roman" w:cs="Times New Roman"/>
+        </w:rPr>
+        <w:lastRenderedPageBreak/>
+        <w:t xml:space="preserve">Development Tools:  Visual Studio 2022, Visual Studio Code, </w:t>
+      </w:r>
+    </w:p>
+    <w:p>
+      <w:pPr>
+        <w:rPr>
+          <w:rFonts w:ascii="Times New Roman" w:hAnsi="Times New Roman" w:cs="Times New Roman"/>
+        </w:rPr>
+      </w:pPr>
+      <w:r>
+        <w:rPr>
+          <w:rFonts w:ascii="Times New Roman" w:hAnsi="Times New Roman" w:cs="Times New Roman"/>
+        </w:rPr>
+        <w:t xml:space="preserve">                     SQL Server Management Studio (SSMS)</w:t>
+      </w:r>
+    </w:p>
+    <w:p>
+      <w:pPr>
+        <w:rPr>
+          <w:rFonts w:ascii="Times New Roman" w:hAnsi="Times New Roman" w:cs="Times New Roman"/>
+        </w:rPr>
+      </w:pPr>
+    </w:p>
+    <w:p>
+      <w:pPr>
+        <w:rPr>
+          <w:rFonts w:ascii="Times New Roman" w:hAnsi="Times New Roman" w:cs="Times New Roman"/>
+        </w:rPr>
+      </w:pPr>
+      <w:r>
+        <w:rPr>
+          <w:rFonts w:ascii="Times New Roman" w:hAnsi="Times New Roman" w:cs="Times New Roman"/>
+        </w:rPr>
+        <w:t>Version Control:    Git, GitHub</w:t>
+      </w:r>
+    </w:p>
+    <w:p>
+      <w:pPr>
+        <w:rPr>
+          <w:rFonts w:ascii="Times New Roman" w:hAnsi="Times New Roman" w:cs="Times New Roman"/>
+        </w:rPr>
+      </w:pPr>
+    </w:p>
+    <w:p>
+      <w:pPr>
+        <w:rPr>
+          <w:rFonts w:ascii="Times New Roman" w:hAnsi="Times New Roman" w:cs="Times New Roman"/>
+        </w:rPr>
+      </w:pPr>
+      <w:r>
+        <w:rPr>
+          <w:rFonts w:ascii="Times New Roman" w:hAnsi="Times New Roman" w:cs="Times New Roman"/>
+        </w:rPr>
+        <w:t>API Testing:        Postman</w:t>
+      </w:r>
+    </w:p>
+    <w:p>
+      <w:pPr>
+        <w:rPr>
+          <w:rFonts w:ascii="Times New Roman" w:hAnsi="Times New Roman" w:cs="Times New Roman"/>
+        </w:rPr>
+      </w:pPr>
+    </w:p>
+    <w:p>
+      <w:pPr>
+        <w:rPr>
+          <w:rFonts w:ascii="Times New Roman" w:hAnsi="Times New Roman" w:cs="Times New Roman"/>
+        </w:rPr>
+      </w:pPr>
+      <w:r>
+        <w:rPr>
+          <w:rFonts w:ascii="Times New Roman" w:hAnsi="Times New Roman" w:cs="Times New Roman"/>
+        </w:rPr>
+        <w:t xml:space="preserve">Architecture:       Clean Architecture (Domain, Application, </w:t>
+      </w:r>
+    </w:p>
+    <w:p>
+      <w:pPr>
+        <w:rPr>
+          <w:rFonts w:ascii="Times New Roman" w:hAnsi="Times New Roman" w:cs="Times New Roman"/>
+        </w:rPr>
+      </w:pPr>
+      <w:r>
+        <w:rPr>
+          <w:rFonts w:ascii="Times New Roman" w:hAnsi="Times New Roman" w:cs="Times New Roman"/>
+        </w:rPr>
+        <w:t xml:space="preserve">                     Infrastructure, API layers)</w:t>
+      </w:r>
+    </w:p>
+    <w:p>
+      <w:pPr>
+        <w:rPr>
+          <w:rFonts w:ascii="Times New Roman" w:hAnsi="Times New Roman" w:cs="Times New Roman"/>
+        </w:rPr>
+      </w:pPr>
+    </w:p>
+    <w:p>
+      <w:pPr>
+        <w:rPr>
+          <w:rFonts w:ascii="Times New Roman" w:hAnsi="Times New Roman" w:cs="Times New Roman"/>
+        </w:rPr>
+      </w:pPr>
+      <w:r>
+        <w:rPr>
+          <w:rFonts w:ascii="Times New Roman" w:hAnsi="Times New Roman" w:cs="Times New Roman"/>
+        </w:rPr>
+        <w:t>Design Pattern:     Repository Pattern, Unit of Work Pattern</w:t>
+      </w:r>
+    </w:p>
+    <w:p>
+      <w:pPr>
+        <w:rPr>
+          <w:rFonts w:ascii="Times New Roman" w:hAnsi="Times New Roman" w:cs="Times New Roman"/>
+        </w:rPr>
+      </w:pPr>
     </w:p>
     <w:p>
       <w:pPr>
@@ -560,6 +2111,40 @@
         <w:rPr>
           <w:rFonts w:ascii="Times New Roman" w:hAnsi="Times New Roman" w:cs="Times New Roman"/>
         </w:rPr>
+        <w:t xml:space="preserve">The Incremental Model has been selected for the development of </w:t>
+      </w:r>
+    </w:p>
+    <w:p>
+      <w:pPr>
+        <w:rPr>
+          <w:rFonts w:ascii="Times New Roman" w:hAnsi="Times New Roman" w:cs="Times New Roman"/>
+        </w:rPr>
+      </w:pPr>
+      <w:proofErr w:type="spellStart"/>
+      <w:r>
+        <w:rPr>
+          <w:rFonts w:ascii="Times New Roman" w:hAnsi="Times New Roman" w:cs="Times New Roman"/>
+        </w:rPr>
+        <w:t>NexusFlow</w:t>
+      </w:r>
+      <w:proofErr w:type="spellEnd"/>
+      <w:r>
+        <w:rPr>
+          <w:rFonts w:ascii="Times New Roman" w:hAnsi="Times New Roman" w:cs="Times New Roman"/>
+        </w:rPr>
+        <w:t>.</w:t>
+      </w:r>
+    </w:p>
+    <w:p>
+      <w:pPr>
+        <w:rPr>
+          <w:rFonts w:ascii="Times New Roman" w:hAnsi="Times New Roman" w:cs="Times New Roman"/>
+        </w:rPr>
+      </w:pPr>
+      <w:r>
+        <w:rPr>
+          <w:rFonts w:ascii="Times New Roman" w:hAnsi="Times New Roman" w:cs="Times New Roman"/>
+        </w:rPr>
         <w:t xml:space="preserve">   6.2 Justification for the Selection of Model</w:t>
       </w:r>
     </w:p>
@@ -569,6 +2154,337 @@
           <w:rFonts w:ascii="Times New Roman" w:hAnsi="Times New Roman" w:cs="Times New Roman"/>
         </w:rPr>
       </w:pPr>
+      <w:proofErr w:type="spellStart"/>
+      <w:r>
+        <w:rPr>
+          <w:rFonts w:ascii="Times New Roman" w:hAnsi="Times New Roman" w:cs="Times New Roman"/>
+        </w:rPr>
+        <w:t>NexusFlow</w:t>
+      </w:r>
+      <w:proofErr w:type="spellEnd"/>
+      <w:r>
+        <w:rPr>
+          <w:rFonts w:ascii="Times New Roman" w:hAnsi="Times New Roman" w:cs="Times New Roman"/>
+        </w:rPr>
+        <w:t xml:space="preserve"> consists of multiple independent but interconnected modules </w:t>
+      </w:r>
+    </w:p>
+    <w:p>
+      <w:pPr>
+        <w:rPr>
+          <w:rFonts w:ascii="Times New Roman" w:hAnsi="Times New Roman" w:cs="Times New Roman"/>
+        </w:rPr>
+      </w:pPr>
+      <w:r>
+        <w:rPr>
+          <w:rFonts w:ascii="Times New Roman" w:hAnsi="Times New Roman" w:cs="Times New Roman"/>
+        </w:rPr>
+        <w:t xml:space="preserve">such as Authentication, Project Management, Task Management, Comments, </w:t>
+      </w:r>
+    </w:p>
+    <w:p>
+      <w:pPr>
+        <w:rPr>
+          <w:rFonts w:ascii="Times New Roman" w:hAnsi="Times New Roman" w:cs="Times New Roman"/>
+        </w:rPr>
+      </w:pPr>
+      <w:r>
+        <w:rPr>
+          <w:rFonts w:ascii="Times New Roman" w:hAnsi="Times New Roman" w:cs="Times New Roman"/>
+        </w:rPr>
+        <w:t xml:space="preserve">and Notifications. The Incremental Model allows each module to be </w:t>
+      </w:r>
+    </w:p>
+    <w:p>
+      <w:pPr>
+        <w:rPr>
+          <w:rFonts w:ascii="Times New Roman" w:hAnsi="Times New Roman" w:cs="Times New Roman"/>
+        </w:rPr>
+      </w:pPr>
+      <w:r>
+        <w:rPr>
+          <w:rFonts w:ascii="Times New Roman" w:hAnsi="Times New Roman" w:cs="Times New Roman"/>
+        </w:rPr>
+        <w:t xml:space="preserve">designed, developed, and tested as a self-contained increment before </w:t>
+      </w:r>
+    </w:p>
+    <w:p>
+      <w:pPr>
+        <w:rPr>
+          <w:rFonts w:ascii="Times New Roman" w:hAnsi="Times New Roman" w:cs="Times New Roman"/>
+        </w:rPr>
+      </w:pPr>
+      <w:r>
+        <w:rPr>
+          <w:rFonts w:ascii="Times New Roman" w:hAnsi="Times New Roman" w:cs="Times New Roman"/>
+        </w:rPr>
+        <w:t>moving to the next, which offers several advantages for this project:</w:t>
+      </w:r>
+    </w:p>
+    <w:p>
+      <w:pPr>
+        <w:rPr>
+          <w:rFonts w:ascii="Times New Roman" w:hAnsi="Times New Roman" w:cs="Times New Roman"/>
+        </w:rPr>
+      </w:pPr>
+    </w:p>
+    <w:p>
+      <w:pPr>
+        <w:rPr>
+          <w:rFonts w:ascii="Times New Roman" w:hAnsi="Times New Roman" w:cs="Times New Roman"/>
+        </w:rPr>
+      </w:pPr>
+      <w:r>
+        <w:rPr>
+          <w:rFonts w:ascii="Times New Roman" w:hAnsi="Times New Roman" w:cs="Times New Roman"/>
+        </w:rPr>
+        <w:t xml:space="preserve">1. Since the project is being developed individually, the Incremental </w:t>
+      </w:r>
+    </w:p>
+    <w:p>
+      <w:pPr>
+        <w:rPr>
+          <w:rFonts w:ascii="Times New Roman" w:hAnsi="Times New Roman" w:cs="Times New Roman"/>
+        </w:rPr>
+      </w:pPr>
+      <w:r>
+        <w:rPr>
+          <w:rFonts w:ascii="Times New Roman" w:hAnsi="Times New Roman" w:cs="Times New Roman"/>
+        </w:rPr>
+        <w:t xml:space="preserve">   Model allows focused development on one module at a time, reducing </w:t>
+      </w:r>
+    </w:p>
+    <w:p>
+      <w:pPr>
+        <w:rPr>
+          <w:rFonts w:ascii="Times New Roman" w:hAnsi="Times New Roman" w:cs="Times New Roman"/>
+        </w:rPr>
+      </w:pPr>
+      <w:r>
+        <w:rPr>
+          <w:rFonts w:ascii="Times New Roman" w:hAnsi="Times New Roman" w:cs="Times New Roman"/>
+        </w:rPr>
+        <w:t xml:space="preserve">   complexity and the risk of errors.</w:t>
+      </w:r>
+    </w:p>
+    <w:p>
+      <w:pPr>
+        <w:rPr>
+          <w:rFonts w:ascii="Times New Roman" w:hAnsi="Times New Roman" w:cs="Times New Roman"/>
+        </w:rPr>
+      </w:pPr>
+    </w:p>
+    <w:p>
+      <w:pPr>
+        <w:rPr>
+          <w:rFonts w:ascii="Times New Roman" w:hAnsi="Times New Roman" w:cs="Times New Roman"/>
+        </w:rPr>
+      </w:pPr>
+      <w:r>
+        <w:rPr>
+          <w:rFonts w:ascii="Times New Roman" w:hAnsi="Times New Roman" w:cs="Times New Roman"/>
+        </w:rPr>
+        <w:t xml:space="preserve">2. Each completed increment (such as the Authentication module) results </w:t>
+      </w:r>
+    </w:p>
+    <w:p>
+      <w:pPr>
+        <w:rPr>
+          <w:rFonts w:ascii="Times New Roman" w:hAnsi="Times New Roman" w:cs="Times New Roman"/>
+        </w:rPr>
+      </w:pPr>
+      <w:r>
+        <w:rPr>
+          <w:rFonts w:ascii="Times New Roman" w:hAnsi="Times New Roman" w:cs="Times New Roman"/>
+        </w:rPr>
+        <w:t xml:space="preserve">   in a working, testable piece of functionality, allowing early </w:t>
+      </w:r>
+    </w:p>
+    <w:p>
+      <w:pPr>
+        <w:rPr>
+          <w:rFonts w:ascii="Times New Roman" w:hAnsi="Times New Roman" w:cs="Times New Roman"/>
+        </w:rPr>
+      </w:pPr>
+      <w:r>
+        <w:rPr>
+          <w:rFonts w:ascii="Times New Roman" w:hAnsi="Times New Roman" w:cs="Times New Roman"/>
+        </w:rPr>
+        <w:t xml:space="preserve">   verification through tools like Postman before proceeding further.</w:t>
+      </w:r>
+    </w:p>
+    <w:p>
+      <w:pPr>
+        <w:rPr>
+          <w:rFonts w:ascii="Times New Roman" w:hAnsi="Times New Roman" w:cs="Times New Roman"/>
+        </w:rPr>
+      </w:pPr>
+    </w:p>
+    <w:p>
+      <w:pPr>
+        <w:rPr>
+          <w:rFonts w:ascii="Times New Roman" w:hAnsi="Times New Roman" w:cs="Times New Roman"/>
+        </w:rPr>
+      </w:pPr>
+      <w:r>
+        <w:rPr>
+          <w:rFonts w:ascii="Times New Roman" w:hAnsi="Times New Roman" w:cs="Times New Roman"/>
+        </w:rPr>
+        <w:t xml:space="preserve">3. Given the fixed academic submission deadlines, the Incremental Model </w:t>
+      </w:r>
+    </w:p>
+    <w:p>
+      <w:pPr>
+        <w:rPr>
+          <w:rFonts w:ascii="Times New Roman" w:hAnsi="Times New Roman" w:cs="Times New Roman"/>
+        </w:rPr>
+      </w:pPr>
+      <w:r>
+        <w:rPr>
+          <w:rFonts w:ascii="Times New Roman" w:hAnsi="Times New Roman" w:cs="Times New Roman"/>
+        </w:rPr>
+        <w:t xml:space="preserve">   ensures that even if time constraints arise, the core modules </w:t>
+      </w:r>
+    </w:p>
+    <w:p>
+      <w:pPr>
+        <w:rPr>
+          <w:rFonts w:ascii="Times New Roman" w:hAnsi="Times New Roman" w:cs="Times New Roman"/>
+        </w:rPr>
+      </w:pPr>
+      <w:r>
+        <w:rPr>
+          <w:rFonts w:ascii="Times New Roman" w:hAnsi="Times New Roman" w:cs="Times New Roman"/>
+        </w:rPr>
+        <w:lastRenderedPageBreak/>
+        <w:t xml:space="preserve">   completed earlier remain fully functional and demonstrable.</w:t>
+      </w:r>
+    </w:p>
+    <w:p>
+      <w:pPr>
+        <w:rPr>
+          <w:rFonts w:ascii="Times New Roman" w:hAnsi="Times New Roman" w:cs="Times New Roman"/>
+        </w:rPr>
+      </w:pPr>
+    </w:p>
+    <w:p>
+      <w:pPr>
+        <w:rPr>
+          <w:rFonts w:ascii="Times New Roman" w:hAnsi="Times New Roman" w:cs="Times New Roman"/>
+        </w:rPr>
+      </w:pPr>
+      <w:r>
+        <w:rPr>
+          <w:rFonts w:ascii="Times New Roman" w:hAnsi="Times New Roman" w:cs="Times New Roman"/>
+        </w:rPr>
+        <w:t xml:space="preserve">4. This model aligns naturally with the project presentation structure </w:t>
+      </w:r>
+    </w:p>
+    <w:p>
+      <w:pPr>
+        <w:rPr>
+          <w:rFonts w:ascii="Times New Roman" w:hAnsi="Times New Roman" w:cs="Times New Roman"/>
+        </w:rPr>
+      </w:pPr>
+      <w:r>
+        <w:rPr>
+          <w:rFonts w:ascii="Times New Roman" w:hAnsi="Times New Roman" w:cs="Times New Roman"/>
+        </w:rPr>
+        <w:t xml:space="preserve">   required by the institute, where an initial presentation is given </w:t>
+      </w:r>
+    </w:p>
+    <w:p>
+      <w:pPr>
+        <w:rPr>
+          <w:rFonts w:ascii="Times New Roman" w:hAnsi="Times New Roman" w:cs="Times New Roman"/>
+        </w:rPr>
+      </w:pPr>
+      <w:r>
+        <w:rPr>
+          <w:rFonts w:ascii="Times New Roman" w:hAnsi="Times New Roman" w:cs="Times New Roman"/>
+        </w:rPr>
+        <w:t xml:space="preserve">   after the design phase and a second presentation after system </w:t>
+      </w:r>
+    </w:p>
+    <w:p>
+      <w:pPr>
+        <w:rPr>
+          <w:rFonts w:ascii="Times New Roman" w:hAnsi="Times New Roman" w:cs="Times New Roman"/>
+        </w:rPr>
+      </w:pPr>
+      <w:r>
+        <w:rPr>
+          <w:rFonts w:ascii="Times New Roman" w:hAnsi="Times New Roman" w:cs="Times New Roman"/>
+        </w:rPr>
+        <w:t xml:space="preserve">   testing is complete.</w:t>
+      </w:r>
+    </w:p>
+    <w:p>
+      <w:pPr>
+        <w:rPr>
+          <w:rFonts w:ascii="Times New Roman" w:hAnsi="Times New Roman" w:cs="Times New Roman"/>
+        </w:rPr>
+      </w:pPr>
+    </w:p>
+    <w:p>
+      <w:pPr>
+        <w:rPr>
+          <w:rFonts w:ascii="Times New Roman" w:hAnsi="Times New Roman" w:cs="Times New Roman"/>
+        </w:rPr>
+      </w:pPr>
+      <w:r>
+        <w:rPr>
+          <w:rFonts w:ascii="Times New Roman" w:hAnsi="Times New Roman" w:cs="Times New Roman"/>
+        </w:rPr>
+        <w:t xml:space="preserve">For these reasons, the Incremental Model was determined to be the most </w:t>
+      </w:r>
+    </w:p>
+    <w:p>
+      <w:pPr>
+        <w:rPr>
+          <w:rFonts w:ascii="Times New Roman" w:hAnsi="Times New Roman" w:cs="Times New Roman"/>
+        </w:rPr>
+      </w:pPr>
+      <w:r>
+        <w:rPr>
+          <w:rFonts w:ascii="Times New Roman" w:hAnsi="Times New Roman" w:cs="Times New Roman"/>
+        </w:rPr>
+        <w:t xml:space="preserve">suitable approach for developing </w:t>
+      </w:r>
+      <w:proofErr w:type="spellStart"/>
+      <w:r>
+        <w:rPr>
+          <w:rFonts w:ascii="Times New Roman" w:hAnsi="Times New Roman" w:cs="Times New Roman"/>
+        </w:rPr>
+        <w:t>NexusFlow</w:t>
+      </w:r>
+      <w:proofErr w:type="spellEnd"/>
+      <w:r>
+        <w:rPr>
+          <w:rFonts w:ascii="Times New Roman" w:hAnsi="Times New Roman" w:cs="Times New Roman"/>
+        </w:rPr>
+        <w:t xml:space="preserve"> within the available </w:t>
+      </w:r>
+    </w:p>
+    <w:p>
+      <w:pPr>
+        <w:rPr>
+          <w:rFonts w:ascii="Times New Roman" w:hAnsi="Times New Roman" w:cs="Times New Roman"/>
+        </w:rPr>
+      </w:pPr>
+      <w:r>
+        <w:rPr>
+          <w:rFonts w:ascii="Times New Roman" w:hAnsi="Times New Roman" w:cs="Times New Roman"/>
+        </w:rPr>
+        <w:t>timeframe.</w:t>
+      </w:r>
+    </w:p>
+    <w:p>
+      <w:pPr>
+        <w:rPr>
+          <w:rFonts w:ascii="Times New Roman" w:hAnsi="Times New Roman" w:cs="Times New Roman"/>
+        </w:rPr>
+      </w:pPr>
     </w:p>
     <w:p>
       <w:pPr>
@@ -589,6 +2505,304 @@
           <w:rFonts w:ascii="Times New Roman" w:hAnsi="Times New Roman" w:cs="Times New Roman"/>
         </w:rPr>
       </w:pPr>
+      <w:r>
+        <w:rPr>
+          <w:rFonts w:ascii="Times New Roman" w:hAnsi="Times New Roman" w:cs="Times New Roman"/>
+        </w:rPr>
+        <w:t xml:space="preserve">While the current scope of </w:t>
+      </w:r>
+      <w:proofErr w:type="spellStart"/>
+      <w:r>
+        <w:rPr>
+          <w:rFonts w:ascii="Times New Roman" w:hAnsi="Times New Roman" w:cs="Times New Roman"/>
+        </w:rPr>
+        <w:t>NexusFlow</w:t>
+      </w:r>
+      <w:proofErr w:type="spellEnd"/>
+      <w:r>
+        <w:rPr>
+          <w:rFonts w:ascii="Times New Roman" w:hAnsi="Times New Roman" w:cs="Times New Roman"/>
+        </w:rPr>
+        <w:t xml:space="preserve"> covers the core modules necessary </w:t>
+      </w:r>
+    </w:p>
+    <w:p>
+      <w:pPr>
+        <w:rPr>
+          <w:rFonts w:ascii="Times New Roman" w:hAnsi="Times New Roman" w:cs="Times New Roman"/>
+        </w:rPr>
+      </w:pPr>
+      <w:r>
+        <w:rPr>
+          <w:rFonts w:ascii="Times New Roman" w:hAnsi="Times New Roman" w:cs="Times New Roman"/>
+        </w:rPr>
+        <w:t xml:space="preserve">for project and team collaboration, the system has been designed with </w:t>
+      </w:r>
+    </w:p>
+    <w:p>
+      <w:pPr>
+        <w:rPr>
+          <w:rFonts w:ascii="Times New Roman" w:hAnsi="Times New Roman" w:cs="Times New Roman"/>
+        </w:rPr>
+      </w:pPr>
+      <w:r>
+        <w:rPr>
+          <w:rFonts w:ascii="Times New Roman" w:hAnsi="Times New Roman" w:cs="Times New Roman"/>
+        </w:rPr>
+        <w:t>extensibility in mind. Potential future enhancements include:</w:t>
+      </w:r>
+    </w:p>
+    <w:p>
+      <w:pPr>
+        <w:rPr>
+          <w:rFonts w:ascii="Times New Roman" w:hAnsi="Times New Roman" w:cs="Times New Roman"/>
+        </w:rPr>
+      </w:pPr>
+    </w:p>
+    <w:p>
+      <w:pPr>
+        <w:rPr>
+          <w:rFonts w:ascii="Times New Roman" w:hAnsi="Times New Roman" w:cs="Times New Roman"/>
+        </w:rPr>
+      </w:pPr>
+      <w:r>
+        <w:rPr>
+          <w:rFonts w:ascii="Times New Roman" w:hAnsi="Times New Roman" w:cs="Times New Roman"/>
+        </w:rPr>
+        <w:t xml:space="preserve">1. Real-time notifications and live updates using </w:t>
+      </w:r>
+      <w:proofErr w:type="spellStart"/>
+      <w:r>
+        <w:rPr>
+          <w:rFonts w:ascii="Times New Roman" w:hAnsi="Times New Roman" w:cs="Times New Roman"/>
+        </w:rPr>
+        <w:t>SignalR</w:t>
+      </w:r>
+      <w:proofErr w:type="spellEnd"/>
+      <w:r>
+        <w:rPr>
+          <w:rFonts w:ascii="Times New Roman" w:hAnsi="Times New Roman" w:cs="Times New Roman"/>
+        </w:rPr>
+        <w:t xml:space="preserve"> for </w:t>
+      </w:r>
+    </w:p>
+    <w:p>
+      <w:pPr>
+        <w:rPr>
+          <w:rFonts w:ascii="Times New Roman" w:hAnsi="Times New Roman" w:cs="Times New Roman"/>
+        </w:rPr>
+      </w:pPr>
+      <w:r>
+        <w:rPr>
+          <w:rFonts w:ascii="Times New Roman" w:hAnsi="Times New Roman" w:cs="Times New Roman"/>
+        </w:rPr>
+        <w:t xml:space="preserve">   instantaneous communication between users.</w:t>
+      </w:r>
+    </w:p>
+    <w:p>
+      <w:pPr>
+        <w:rPr>
+          <w:rFonts w:ascii="Times New Roman" w:hAnsi="Times New Roman" w:cs="Times New Roman"/>
+        </w:rPr>
+      </w:pPr>
+    </w:p>
+    <w:p>
+      <w:pPr>
+        <w:rPr>
+          <w:rFonts w:ascii="Times New Roman" w:hAnsi="Times New Roman" w:cs="Times New Roman"/>
+        </w:rPr>
+      </w:pPr>
+      <w:r>
+        <w:rPr>
+          <w:rFonts w:ascii="Times New Roman" w:hAnsi="Times New Roman" w:cs="Times New Roman"/>
+        </w:rPr>
+        <w:t xml:space="preserve">2. File attachment support for tasks and projects using cloud storage </w:t>
+      </w:r>
+    </w:p>
+    <w:p>
+      <w:pPr>
+        <w:rPr>
+          <w:rFonts w:ascii="Times New Roman" w:hAnsi="Times New Roman" w:cs="Times New Roman"/>
+        </w:rPr>
+      </w:pPr>
+      <w:r>
+        <w:rPr>
+          <w:rFonts w:ascii="Times New Roman" w:hAnsi="Times New Roman" w:cs="Times New Roman"/>
+        </w:rPr>
+        <w:t xml:space="preserve">   integration such as Azure Blob Storage.</w:t>
+      </w:r>
+    </w:p>
+    <w:p>
+      <w:pPr>
+        <w:rPr>
+          <w:rFonts w:ascii="Times New Roman" w:hAnsi="Times New Roman" w:cs="Times New Roman"/>
+        </w:rPr>
+      </w:pPr>
+    </w:p>
+    <w:p>
+      <w:pPr>
+        <w:rPr>
+          <w:rFonts w:ascii="Times New Roman" w:hAnsi="Times New Roman" w:cs="Times New Roman"/>
+        </w:rPr>
+      </w:pPr>
+      <w:r>
+        <w:rPr>
+          <w:rFonts w:ascii="Times New Roman" w:hAnsi="Times New Roman" w:cs="Times New Roman"/>
+        </w:rPr>
+        <w:t xml:space="preserve">3. Calendar and meeting scheduling module for coordinating team </w:t>
+      </w:r>
+    </w:p>
+    <w:p>
+      <w:pPr>
+        <w:rPr>
+          <w:rFonts w:ascii="Times New Roman" w:hAnsi="Times New Roman" w:cs="Times New Roman"/>
+        </w:rPr>
+      </w:pPr>
+      <w:r>
+        <w:rPr>
+          <w:rFonts w:ascii="Times New Roman" w:hAnsi="Times New Roman" w:cs="Times New Roman"/>
+        </w:rPr>
+        <w:t xml:space="preserve">   availability and deadlines.</w:t>
+      </w:r>
+    </w:p>
+    <w:p>
+      <w:pPr>
+        <w:rPr>
+          <w:rFonts w:ascii="Times New Roman" w:hAnsi="Times New Roman" w:cs="Times New Roman"/>
+        </w:rPr>
+      </w:pPr>
+    </w:p>
+    <w:p>
+      <w:pPr>
+        <w:rPr>
+          <w:rFonts w:ascii="Times New Roman" w:hAnsi="Times New Roman" w:cs="Times New Roman"/>
+        </w:rPr>
+      </w:pPr>
+      <w:r>
+        <w:rPr>
+          <w:rFonts w:ascii="Times New Roman" w:hAnsi="Times New Roman" w:cs="Times New Roman"/>
+        </w:rPr>
+        <w:t xml:space="preserve">4. Advanced analytics and reporting with visual dashboards using </w:t>
+      </w:r>
+    </w:p>
+    <w:p>
+      <w:pPr>
+        <w:rPr>
+          <w:rFonts w:ascii="Times New Roman" w:hAnsi="Times New Roman" w:cs="Times New Roman"/>
+        </w:rPr>
+      </w:pPr>
+      <w:r>
+        <w:rPr>
+          <w:rFonts w:ascii="Times New Roman" w:hAnsi="Times New Roman" w:cs="Times New Roman"/>
+        </w:rPr>
+        <w:t xml:space="preserve">   Chart.js, including burn-down charts and team performance metrics.</w:t>
+      </w:r>
+    </w:p>
+    <w:p>
+      <w:pPr>
+        <w:rPr>
+          <w:rFonts w:ascii="Times New Roman" w:hAnsi="Times New Roman" w:cs="Times New Roman"/>
+        </w:rPr>
+      </w:pPr>
+    </w:p>
+    <w:p>
+      <w:pPr>
+        <w:rPr>
+          <w:rFonts w:ascii="Times New Roman" w:hAnsi="Times New Roman" w:cs="Times New Roman"/>
+        </w:rPr>
+      </w:pPr>
+      <w:r>
+        <w:rPr>
+          <w:rFonts w:ascii="Times New Roman" w:hAnsi="Times New Roman" w:cs="Times New Roman"/>
+        </w:rPr>
+        <w:t xml:space="preserve">5. Mobile application support through a Progressive Web App (PWA) </w:t>
+      </w:r>
+    </w:p>
+    <w:p>
+      <w:pPr>
+        <w:rPr>
+          <w:rFonts w:ascii="Times New Roman" w:hAnsi="Times New Roman" w:cs="Times New Roman"/>
+        </w:rPr>
+      </w:pPr>
+      <w:r>
+        <w:rPr>
+          <w:rFonts w:ascii="Times New Roman" w:hAnsi="Times New Roman" w:cs="Times New Roman"/>
+        </w:rPr>
+        <w:t xml:space="preserve">   implementation of the Angular frontend.</w:t>
+      </w:r>
+    </w:p>
+    <w:p>
+      <w:pPr>
+        <w:rPr>
+          <w:rFonts w:ascii="Times New Roman" w:hAnsi="Times New Roman" w:cs="Times New Roman"/>
+        </w:rPr>
+      </w:pPr>
+    </w:p>
+    <w:p>
+      <w:pPr>
+        <w:rPr>
+          <w:rFonts w:ascii="Times New Roman" w:hAnsi="Times New Roman" w:cs="Times New Roman"/>
+        </w:rPr>
+      </w:pPr>
+      <w:r>
+        <w:rPr>
+          <w:rFonts w:ascii="Times New Roman" w:hAnsi="Times New Roman" w:cs="Times New Roman"/>
+        </w:rPr>
+        <w:t xml:space="preserve">6. AI-based task prioritization that suggests optimal task ordering </w:t>
+      </w:r>
+    </w:p>
+    <w:p>
+      <w:pPr>
+        <w:rPr>
+          <w:rFonts w:ascii="Times New Roman" w:hAnsi="Times New Roman" w:cs="Times New Roman"/>
+        </w:rPr>
+      </w:pPr>
+      <w:r>
+        <w:rPr>
+          <w:rFonts w:ascii="Times New Roman" w:hAnsi="Times New Roman" w:cs="Times New Roman"/>
+        </w:rPr>
+        <w:t xml:space="preserve">   based on deadlines, dependencies, and team workload.</w:t>
+      </w:r>
+    </w:p>
+    <w:p>
+      <w:pPr>
+        <w:rPr>
+          <w:rFonts w:ascii="Times New Roman" w:hAnsi="Times New Roman" w:cs="Times New Roman"/>
+        </w:rPr>
+      </w:pPr>
+    </w:p>
+    <w:p>
+      <w:pPr>
+        <w:rPr>
+          <w:rFonts w:ascii="Times New Roman" w:hAnsi="Times New Roman" w:cs="Times New Roman"/>
+        </w:rPr>
+      </w:pPr>
+      <w:r>
+        <w:rPr>
+          <w:rFonts w:ascii="Times New Roman" w:hAnsi="Times New Roman" w:cs="Times New Roman"/>
+        </w:rPr>
+        <w:t xml:space="preserve">7. Integration with third-party tools such as GitHub for linking code </w:t>
+      </w:r>
+    </w:p>
+    <w:p>
+      <w:pPr>
+        <w:rPr>
+          <w:rFonts w:ascii="Times New Roman" w:hAnsi="Times New Roman" w:cs="Times New Roman"/>
+        </w:rPr>
+      </w:pPr>
+      <w:r>
+        <w:rPr>
+          <w:rFonts w:ascii="Times New Roman" w:hAnsi="Times New Roman" w:cs="Times New Roman"/>
+        </w:rPr>
+        <w:t xml:space="preserve">   commits directly to tasks.</w:t>
+      </w:r>
+    </w:p>
+    <w:p>
+      <w:pPr>
+        <w:rPr>
+          <w:rFonts w:ascii="Times New Roman" w:hAnsi="Times New Roman" w:cs="Times New Roman"/>
+        </w:rPr>
+      </w:pPr>
     </w:p>
     <w:p>
       <w:pPr>
@@ -601,6 +2815,258 @@
           <w:rFonts w:ascii="Times New Roman" w:hAnsi="Times New Roman" w:cs="Times New Roman"/>
         </w:rPr>
         <w:t>8. References</w:t>
+      </w:r>
+    </w:p>
+    <w:p>
+      <w:pPr>
+        <w:rPr>
+          <w:rFonts w:ascii="Times New Roman" w:hAnsi="Times New Roman" w:cs="Times New Roman"/>
+        </w:rPr>
+      </w:pPr>
+      <w:r>
+        <w:rPr>
+          <w:rFonts w:ascii="Times New Roman" w:hAnsi="Times New Roman" w:cs="Times New Roman"/>
+        </w:rPr>
+        <w:t xml:space="preserve">[1] Microsoft. (2024). ASP.NET Core Documentation. </w:t>
+      </w:r>
+    </w:p>
+    <w:p>
+      <w:pPr>
+        <w:rPr>
+          <w:rFonts w:ascii="Times New Roman" w:hAnsi="Times New Roman" w:cs="Times New Roman"/>
+        </w:rPr>
+      </w:pPr>
+      <w:r>
+        <w:rPr>
+          <w:rFonts w:ascii="Times New Roman" w:hAnsi="Times New Roman" w:cs="Times New Roman"/>
+        </w:rPr>
+        <w:t xml:space="preserve">    Retrieved from https://learn.microsoft.com/en-us/aspnet/core</w:t>
+      </w:r>
+    </w:p>
+    <w:p>
+      <w:pPr>
+        <w:rPr>
+          <w:rFonts w:ascii="Times New Roman" w:hAnsi="Times New Roman" w:cs="Times New Roman"/>
+        </w:rPr>
+      </w:pPr>
+    </w:p>
+    <w:p>
+      <w:pPr>
+        <w:rPr>
+          <w:rFonts w:ascii="Times New Roman" w:hAnsi="Times New Roman" w:cs="Times New Roman"/>
+        </w:rPr>
+      </w:pPr>
+      <w:r>
+        <w:rPr>
+          <w:rFonts w:ascii="Times New Roman" w:hAnsi="Times New Roman" w:cs="Times New Roman"/>
+        </w:rPr>
+        <w:t xml:space="preserve">[2] Google. (2024). Angular Documentation. </w:t>
+      </w:r>
+    </w:p>
+    <w:p>
+      <w:pPr>
+        <w:rPr>
+          <w:rFonts w:ascii="Times New Roman" w:hAnsi="Times New Roman" w:cs="Times New Roman"/>
+        </w:rPr>
+      </w:pPr>
+      <w:r>
+        <w:rPr>
+          <w:rFonts w:ascii="Times New Roman" w:hAnsi="Times New Roman" w:cs="Times New Roman"/>
+        </w:rPr>
+        <w:t xml:space="preserve">    Retrieved from https://angular.dev</w:t>
+      </w:r>
+    </w:p>
+    <w:p>
+      <w:pPr>
+        <w:rPr>
+          <w:rFonts w:ascii="Times New Roman" w:hAnsi="Times New Roman" w:cs="Times New Roman"/>
+        </w:rPr>
+      </w:pPr>
+    </w:p>
+    <w:p>
+      <w:pPr>
+        <w:rPr>
+          <w:rFonts w:ascii="Times New Roman" w:hAnsi="Times New Roman" w:cs="Times New Roman"/>
+        </w:rPr>
+      </w:pPr>
+      <w:r>
+        <w:rPr>
+          <w:rFonts w:ascii="Times New Roman" w:hAnsi="Times New Roman" w:cs="Times New Roman"/>
+        </w:rPr>
+        <w:t xml:space="preserve">[3] Microsoft. (2024). SQL Server 2022 Documentation. </w:t>
+      </w:r>
+    </w:p>
+    <w:p>
+      <w:pPr>
+        <w:rPr>
+          <w:rFonts w:ascii="Times New Roman" w:hAnsi="Times New Roman" w:cs="Times New Roman"/>
+        </w:rPr>
+      </w:pPr>
+      <w:r>
+        <w:rPr>
+          <w:rFonts w:ascii="Times New Roman" w:hAnsi="Times New Roman" w:cs="Times New Roman"/>
+        </w:rPr>
+        <w:t xml:space="preserve">    Retrieved from https://learn.microsoft.com/en-us/sql/sql-server</w:t>
+      </w:r>
+    </w:p>
+    <w:p>
+      <w:pPr>
+        <w:rPr>
+          <w:rFonts w:ascii="Times New Roman" w:hAnsi="Times New Roman" w:cs="Times New Roman"/>
+        </w:rPr>
+      </w:pPr>
+    </w:p>
+    <w:p>
+      <w:pPr>
+        <w:rPr>
+          <w:rFonts w:ascii="Times New Roman" w:hAnsi="Times New Roman" w:cs="Times New Roman"/>
+        </w:rPr>
+      </w:pPr>
+      <w:r>
+        <w:rPr>
+          <w:rFonts w:ascii="Times New Roman" w:hAnsi="Times New Roman" w:cs="Times New Roman"/>
+        </w:rPr>
+        <w:t xml:space="preserve">[4] Microsoft. (2024). Entity Framework Core Documentation. </w:t>
+      </w:r>
+    </w:p>
+    <w:p>
+      <w:pPr>
+        <w:rPr>
+          <w:rFonts w:ascii="Times New Roman" w:hAnsi="Times New Roman" w:cs="Times New Roman"/>
+        </w:rPr>
+      </w:pPr>
+      <w:r>
+        <w:rPr>
+          <w:rFonts w:ascii="Times New Roman" w:hAnsi="Times New Roman" w:cs="Times New Roman"/>
+        </w:rPr>
+        <w:t xml:space="preserve">    Retrieved from https://learn.microsoft.com/en-us/ef/core</w:t>
+      </w:r>
+    </w:p>
+    <w:p>
+      <w:pPr>
+        <w:rPr>
+          <w:rFonts w:ascii="Times New Roman" w:hAnsi="Times New Roman" w:cs="Times New Roman"/>
+        </w:rPr>
+      </w:pPr>
+    </w:p>
+    <w:p>
+      <w:pPr>
+        <w:rPr>
+          <w:rFonts w:ascii="Times New Roman" w:hAnsi="Times New Roman" w:cs="Times New Roman"/>
+        </w:rPr>
+      </w:pPr>
+      <w:r>
+        <w:rPr>
+          <w:rFonts w:ascii="Times New Roman" w:hAnsi="Times New Roman" w:cs="Times New Roman"/>
+        </w:rPr>
+        <w:t xml:space="preserve">[5] Fowler, M. (2002). Patterns of Enterprise Application Architecture. </w:t>
+      </w:r>
+    </w:p>
+    <w:p>
+      <w:pPr>
+        <w:rPr>
+          <w:rFonts w:ascii="Times New Roman" w:hAnsi="Times New Roman" w:cs="Times New Roman"/>
+        </w:rPr>
+      </w:pPr>
+      <w:r>
+        <w:rPr>
+          <w:rFonts w:ascii="Times New Roman" w:hAnsi="Times New Roman" w:cs="Times New Roman"/>
+        </w:rPr>
+        <w:t xml:space="preserve">    Boston: Addison-Wesley.</w:t>
+      </w:r>
+    </w:p>
+    <w:p>
+      <w:pPr>
+        <w:rPr>
+          <w:rFonts w:ascii="Times New Roman" w:hAnsi="Times New Roman" w:cs="Times New Roman"/>
+        </w:rPr>
+      </w:pPr>
+    </w:p>
+    <w:p>
+      <w:pPr>
+        <w:rPr>
+          <w:rFonts w:ascii="Times New Roman" w:hAnsi="Times New Roman" w:cs="Times New Roman"/>
+        </w:rPr>
+      </w:pPr>
+      <w:r>
+        <w:rPr>
+          <w:rFonts w:ascii="Times New Roman" w:hAnsi="Times New Roman" w:cs="Times New Roman"/>
+        </w:rPr>
+        <w:t xml:space="preserve">[6] </w:t>
+      </w:r>
+      <w:proofErr w:type="spellStart"/>
+      <w:r>
+        <w:rPr>
+          <w:rFonts w:ascii="Times New Roman" w:hAnsi="Times New Roman" w:cs="Times New Roman"/>
+        </w:rPr>
+        <w:t>TuxAcademy</w:t>
+      </w:r>
+      <w:proofErr w:type="spellEnd"/>
+      <w:r>
+        <w:rPr>
+          <w:rFonts w:ascii="Times New Roman" w:hAnsi="Times New Roman" w:cs="Times New Roman"/>
+        </w:rPr>
+        <w:t xml:space="preserve"> / Linux Mantra IT Services </w:t>
+      </w:r>
+      <w:proofErr w:type="spellStart"/>
+      <w:r>
+        <w:rPr>
+          <w:rFonts w:ascii="Times New Roman" w:hAnsi="Times New Roman" w:cs="Times New Roman"/>
+        </w:rPr>
+        <w:t>Pvt.</w:t>
+      </w:r>
+      <w:proofErr w:type="spellEnd"/>
+      <w:r>
+        <w:rPr>
+          <w:rFonts w:ascii="Times New Roman" w:hAnsi="Times New Roman" w:cs="Times New Roman"/>
+        </w:rPr>
+        <w:t xml:space="preserve"> Ltd. (2026). </w:t>
+      </w:r>
+    </w:p>
+    <w:p>
+      <w:pPr>
+        <w:rPr>
+          <w:rFonts w:ascii="Times New Roman" w:hAnsi="Times New Roman" w:cs="Times New Roman"/>
+        </w:rPr>
+      </w:pPr>
+      <w:r>
+        <w:rPr>
+          <w:rFonts w:ascii="Times New Roman" w:hAnsi="Times New Roman" w:cs="Times New Roman"/>
+        </w:rPr>
+        <w:t xml:space="preserve">    Full Stack Development Training Program Materials.</w:t>
+      </w:r>
+    </w:p>
+    <w:p>
+      <w:pPr>
+        <w:rPr>
+          <w:rFonts w:ascii="Times New Roman" w:hAnsi="Times New Roman" w:cs="Times New Roman"/>
+        </w:rPr>
+      </w:pPr>
+    </w:p>
+    <w:p>
+      <w:pPr>
+        <w:rPr>
+          <w:rFonts w:ascii="Times New Roman" w:hAnsi="Times New Roman" w:cs="Times New Roman"/>
+        </w:rPr>
+      </w:pPr>
+      <w:r>
+        <w:rPr>
+          <w:rFonts w:ascii="Times New Roman" w:hAnsi="Times New Roman" w:cs="Times New Roman"/>
+        </w:rPr>
+        <w:t xml:space="preserve">[7] Institute of Information Technology &amp; Management. (2026). </w:t>
+      </w:r>
+    </w:p>
+    <w:p>
+      <w:pPr>
+        <w:rPr>
+          <w:rFonts w:ascii="Times New Roman" w:hAnsi="Times New Roman" w:cs="Times New Roman"/>
+        </w:rPr>
+      </w:pPr>
+      <w:r>
+        <w:rPr>
+          <w:rFonts w:ascii="Times New Roman" w:hAnsi="Times New Roman" w:cs="Times New Roman"/>
+        </w:rPr>
+        <w:t xml:space="preserve">    Summer Training Project Guidelines.</w:t>
       </w:r>
     </w:p>
     <w:sectPr>

</xml_diff>